<commit_message>
updated class 7,class 9, class 10
</commit_message>
<xml_diff>
--- a/pdf/class 10/CLASS 10 CH-5.docx
+++ b/pdf/class 10/CLASS 10 CH-5.docx
@@ -355,7 +355,39 @@
           <w:color w:val="7030A0"/>
           <w:sz w:val="40"/>
         </w:rPr>
-        <w:t xml:space="preserve"> (2025-26)</w:t>
+        <w:t xml:space="preserve"> (202</w:t>
+      </w:r>
+      <w:r>
+        <w:rPr>
+          <w:rFonts w:ascii="Times New Roman" w:hAnsi="Times New Roman" w:cs="Times New Roman"/>
+          <w:color w:val="7030A0"/>
+          <w:sz w:val="40"/>
+        </w:rPr>
+        <w:t>6</w:t>
+      </w:r>
+      <w:r>
+        <w:rPr>
+          <w:rFonts w:ascii="Times New Roman" w:hAnsi="Times New Roman" w:cs="Times New Roman"/>
+          <w:color w:val="7030A0"/>
+          <w:sz w:val="40"/>
+        </w:rPr>
+        <w:t>-2</w:t>
+      </w:r>
+      <w:r>
+        <w:rPr>
+          <w:rFonts w:ascii="Times New Roman" w:hAnsi="Times New Roman" w:cs="Times New Roman"/>
+          <w:color w:val="7030A0"/>
+          <w:sz w:val="40"/>
+        </w:rPr>
+        <w:t>7</w:t>
+      </w:r>
+      <w:r>
+        <w:rPr>
+          <w:rFonts w:ascii="Times New Roman" w:hAnsi="Times New Roman" w:cs="Times New Roman"/>
+          <w:color w:val="7030A0"/>
+          <w:sz w:val="40"/>
+        </w:rPr>
+        <w:t>)</w:t>
       </w:r>
     </w:p>
     <w:p>
@@ -410,8 +442,6 @@
         </w:rPr>
         <w:t>5</w:t>
       </w:r>
-      <w:bookmarkStart w:id="0" w:name="_GoBack"/>
-      <w:bookmarkEnd w:id="0"/>
     </w:p>
     <w:p>
       <w:pPr>
@@ -458,12 +488,3477 @@
     </w:p>
     <w:p>
       <w:pPr>
+        <w:spacing w:before="100" w:beforeAutospacing="1" w:after="100" w:afterAutospacing="1" w:line="240" w:lineRule="auto"/>
+        <w:outlineLvl w:val="0"/>
+        <w:rPr>
+          <w:rFonts w:ascii="Times New Roman" w:eastAsia="Times New Roman" w:hAnsi="Times New Roman" w:cs="Times New Roman"/>
+          <w:b/>
+          <w:bCs/>
+          <w:color w:val="00B0F0"/>
+          <w:kern w:val="36"/>
+          <w:sz w:val="48"/>
+          <w:szCs w:val="48"/>
+        </w:rPr>
+      </w:pPr>
+      <w:r>
+        <w:rPr>
+          <w:rFonts w:ascii="Times New Roman" w:eastAsia="Times New Roman" w:hAnsi="Times New Roman" w:cs="Times New Roman"/>
+          <w:b/>
+          <w:bCs/>
+          <w:color w:val="00B0F0"/>
+          <w:kern w:val="36"/>
+          <w:sz w:val="48"/>
+          <w:szCs w:val="48"/>
+        </w:rPr>
+        <w:t>A. Tick (</w:t>
+      </w:r>
+      <w:r>
+        <w:rPr>
+          <w:rFonts w:ascii="Segoe UI Symbol" w:eastAsia="Times New Roman" w:hAnsi="Segoe UI Symbol" w:cs="Segoe UI Symbol"/>
+          <w:b/>
+          <w:bCs/>
+          <w:color w:val="00B0F0"/>
+          <w:kern w:val="36"/>
+          <w:sz w:val="48"/>
+          <w:szCs w:val="48"/>
+        </w:rPr>
+        <w:t>✓</w:t>
+      </w:r>
+      <w:r>
+        <w:rPr>
+          <w:rFonts w:ascii="Times New Roman" w:eastAsia="Times New Roman" w:hAnsi="Times New Roman" w:cs="Times New Roman"/>
+          <w:b/>
+          <w:bCs/>
+          <w:color w:val="00B0F0"/>
+          <w:kern w:val="36"/>
+          <w:sz w:val="48"/>
+          <w:szCs w:val="48"/>
+        </w:rPr>
+        <w:t>) the correct answer</w:t>
+      </w:r>
+    </w:p>
+    <w:p>
+      <w:pPr>
+        <w:spacing w:before="100" w:beforeAutospacing="1" w:after="100" w:afterAutospacing="1" w:line="240" w:lineRule="auto"/>
+        <w:outlineLvl w:val="2"/>
+        <w:rPr>
+          <w:rFonts w:ascii="Times New Roman" w:eastAsia="Times New Roman" w:hAnsi="Times New Roman" w:cs="Times New Roman"/>
+          <w:b/>
+          <w:bCs/>
+          <w:color w:val="00B050"/>
+          <w:sz w:val="27"/>
+          <w:szCs w:val="27"/>
+        </w:rPr>
+      </w:pPr>
+      <w:r>
+        <w:rPr>
+          <w:rFonts w:ascii="Times New Roman" w:eastAsia="Times New Roman" w:hAnsi="Times New Roman" w:cs="Times New Roman"/>
+          <w:b/>
+          <w:bCs/>
+          <w:color w:val="00B050"/>
+          <w:sz w:val="27"/>
+          <w:szCs w:val="27"/>
+        </w:rPr>
+        <w:t>Q1. Which of the following types of error will give the following code?</w:t>
+      </w:r>
+    </w:p>
+    <w:p>
+      <w:pPr>
+        <w:tabs>
+          <w:tab w:val="left" w:pos="916"/>
+          <w:tab w:val="left" w:pos="1832"/>
+          <w:tab w:val="left" w:pos="2748"/>
+          <w:tab w:val="left" w:pos="3664"/>
+          <w:tab w:val="left" w:pos="4580"/>
+          <w:tab w:val="left" w:pos="5496"/>
+          <w:tab w:val="left" w:pos="6412"/>
+          <w:tab w:val="left" w:pos="7328"/>
+          <w:tab w:val="left" w:pos="8244"/>
+          <w:tab w:val="left" w:pos="9160"/>
+          <w:tab w:val="left" w:pos="10076"/>
+          <w:tab w:val="left" w:pos="10992"/>
+          <w:tab w:val="left" w:pos="11908"/>
+          <w:tab w:val="left" w:pos="12824"/>
+          <w:tab w:val="left" w:pos="13740"/>
+          <w:tab w:val="left" w:pos="14656"/>
+        </w:tabs>
+        <w:spacing w:after="0" w:line="240" w:lineRule="auto"/>
+        <w:rPr>
+          <w:rFonts w:ascii="Courier New" w:eastAsia="Times New Roman" w:hAnsi="Courier New" w:cs="Courier New"/>
+          <w:sz w:val="20"/>
+          <w:szCs w:val="20"/>
+        </w:rPr>
+      </w:pPr>
+      <w:proofErr w:type="gramStart"/>
+      <w:r>
+        <w:rPr>
+          <w:rFonts w:ascii="Courier New" w:eastAsia="Times New Roman" w:hAnsi="Courier New" w:cs="Courier New"/>
+          <w:sz w:val="20"/>
+          <w:szCs w:val="20"/>
+        </w:rPr>
+        <w:t>for(</w:t>
+      </w:r>
+      <w:proofErr w:type="spellStart"/>
+      <w:proofErr w:type="gramEnd"/>
+      <w:r>
+        <w:rPr>
+          <w:rFonts w:ascii="Courier New" w:eastAsia="Times New Roman" w:hAnsi="Courier New" w:cs="Courier New"/>
+          <w:sz w:val="20"/>
+          <w:szCs w:val="20"/>
+        </w:rPr>
+        <w:t>int</w:t>
+      </w:r>
+      <w:proofErr w:type="spellEnd"/>
+      <w:r>
+        <w:rPr>
+          <w:rFonts w:ascii="Courier New" w:eastAsia="Times New Roman" w:hAnsi="Courier New" w:cs="Courier New"/>
+          <w:sz w:val="20"/>
+          <w:szCs w:val="20"/>
+        </w:rPr>
+        <w:t xml:space="preserve"> </w:t>
+      </w:r>
+      <w:proofErr w:type="spellStart"/>
+      <w:r>
+        <w:rPr>
+          <w:rFonts w:ascii="Courier New" w:eastAsia="Times New Roman" w:hAnsi="Courier New" w:cs="Courier New"/>
+          <w:sz w:val="20"/>
+          <w:szCs w:val="20"/>
+        </w:rPr>
+        <w:t>i</w:t>
+      </w:r>
+      <w:proofErr w:type="spellEnd"/>
+      <w:r>
+        <w:rPr>
+          <w:rFonts w:ascii="Courier New" w:eastAsia="Times New Roman" w:hAnsi="Courier New" w:cs="Courier New"/>
+          <w:sz w:val="20"/>
+          <w:szCs w:val="20"/>
+        </w:rPr>
+        <w:t xml:space="preserve">=1; </w:t>
+      </w:r>
+      <w:proofErr w:type="spellStart"/>
+      <w:r>
+        <w:rPr>
+          <w:rFonts w:ascii="Courier New" w:eastAsia="Times New Roman" w:hAnsi="Courier New" w:cs="Courier New"/>
+          <w:sz w:val="20"/>
+          <w:szCs w:val="20"/>
+        </w:rPr>
+        <w:t>i</w:t>
+      </w:r>
+      <w:proofErr w:type="spellEnd"/>
+      <w:r>
+        <w:rPr>
+          <w:rFonts w:ascii="Courier New" w:eastAsia="Times New Roman" w:hAnsi="Courier New" w:cs="Courier New"/>
+          <w:sz w:val="20"/>
+          <w:szCs w:val="20"/>
+        </w:rPr>
+        <w:t xml:space="preserve">&gt;10; </w:t>
+      </w:r>
+      <w:proofErr w:type="spellStart"/>
+      <w:r>
+        <w:rPr>
+          <w:rFonts w:ascii="Courier New" w:eastAsia="Times New Roman" w:hAnsi="Courier New" w:cs="Courier New"/>
+          <w:sz w:val="20"/>
+          <w:szCs w:val="20"/>
+        </w:rPr>
+        <w:t>i</w:t>
+      </w:r>
+      <w:proofErr w:type="spellEnd"/>
+      <w:r>
+        <w:rPr>
+          <w:rFonts w:ascii="Courier New" w:eastAsia="Times New Roman" w:hAnsi="Courier New" w:cs="Courier New"/>
+          <w:sz w:val="20"/>
+          <w:szCs w:val="20"/>
+        </w:rPr>
+        <w:t>++)</w:t>
+      </w:r>
+    </w:p>
+    <w:p>
+      <w:pPr>
+        <w:spacing w:before="100" w:beforeAutospacing="1" w:after="100" w:afterAutospacing="1" w:line="240" w:lineRule="auto"/>
+        <w:rPr>
+          <w:rFonts w:ascii="Times New Roman" w:eastAsia="Times New Roman" w:hAnsi="Times New Roman" w:cs="Times New Roman"/>
+          <w:sz w:val="24"/>
+          <w:szCs w:val="24"/>
+        </w:rPr>
+      </w:pPr>
+      <w:r>
+        <w:rPr>
+          <w:rFonts w:ascii="Times New Roman" w:eastAsia="Times New Roman" w:hAnsi="Times New Roman" w:cs="Times New Roman"/>
+          <w:sz w:val="24"/>
+          <w:szCs w:val="24"/>
+        </w:rPr>
+        <w:t>a. Syntax</w:t>
+      </w:r>
+      <w:r>
+        <w:rPr>
+          <w:rFonts w:ascii="Times New Roman" w:eastAsia="Times New Roman" w:hAnsi="Times New Roman" w:cs="Times New Roman"/>
+          <w:sz w:val="24"/>
+          <w:szCs w:val="24"/>
+        </w:rPr>
+        <w:br/>
+        <w:t>b. Runtime</w:t>
+      </w:r>
+      <w:r>
+        <w:rPr>
+          <w:rFonts w:ascii="Times New Roman" w:eastAsia="Times New Roman" w:hAnsi="Times New Roman" w:cs="Times New Roman"/>
+          <w:sz w:val="24"/>
+          <w:szCs w:val="24"/>
+        </w:rPr>
+        <w:br/>
+        <w:t>c. Logical</w:t>
+      </w:r>
+      <w:r>
+        <w:rPr>
+          <w:rFonts w:ascii="Times New Roman" w:eastAsia="Times New Roman" w:hAnsi="Times New Roman" w:cs="Times New Roman"/>
+          <w:sz w:val="24"/>
+          <w:szCs w:val="24"/>
+        </w:rPr>
+        <w:br/>
+        <w:t>d. None of these</w:t>
+      </w:r>
+    </w:p>
+    <w:p>
+      <w:pPr>
+        <w:spacing w:before="100" w:beforeAutospacing="1" w:after="100" w:afterAutospacing="1" w:line="240" w:lineRule="auto"/>
+        <w:rPr>
+          <w:rFonts w:ascii="Times New Roman" w:eastAsia="Times New Roman" w:hAnsi="Times New Roman" w:cs="Times New Roman"/>
+          <w:color w:val="FF0000"/>
+          <w:sz w:val="24"/>
+          <w:szCs w:val="24"/>
+        </w:rPr>
+      </w:pPr>
+      <w:r>
+        <w:rPr>
+          <w:rFonts w:ascii="Times New Roman" w:eastAsia="Times New Roman" w:hAnsi="Times New Roman" w:cs="Times New Roman"/>
+          <w:b/>
+          <w:bCs/>
+          <w:color w:val="FF0000"/>
+          <w:sz w:val="24"/>
+          <w:szCs w:val="24"/>
+        </w:rPr>
+        <w:t>Answer:</w:t>
+      </w:r>
+      <w:r>
+        <w:rPr>
+          <w:rFonts w:ascii="Times New Roman" w:eastAsia="Times New Roman" w:hAnsi="Times New Roman" w:cs="Times New Roman"/>
+          <w:color w:val="FF0000"/>
+          <w:sz w:val="24"/>
+          <w:szCs w:val="24"/>
+        </w:rPr>
+        <w:t xml:space="preserve"> c. Logical</w:t>
+      </w:r>
+    </w:p>
+    <w:p>
+      <w:pPr>
+        <w:spacing w:before="100" w:beforeAutospacing="1" w:after="100" w:afterAutospacing="1" w:line="240" w:lineRule="auto"/>
+        <w:outlineLvl w:val="2"/>
+        <w:rPr>
+          <w:rFonts w:ascii="Times New Roman" w:eastAsia="Times New Roman" w:hAnsi="Times New Roman" w:cs="Times New Roman"/>
+          <w:b/>
+          <w:bCs/>
+          <w:color w:val="00B050"/>
+          <w:sz w:val="27"/>
+          <w:szCs w:val="27"/>
+        </w:rPr>
+      </w:pPr>
+      <w:r>
+        <w:rPr>
+          <w:rFonts w:ascii="Times New Roman" w:eastAsia="Times New Roman" w:hAnsi="Times New Roman" w:cs="Times New Roman"/>
+          <w:b/>
+          <w:bCs/>
+          <w:color w:val="00B050"/>
+          <w:sz w:val="27"/>
+          <w:szCs w:val="27"/>
+        </w:rPr>
+        <w:t xml:space="preserve">Q2. The scanner </w:t>
+      </w:r>
+      <w:proofErr w:type="spellStart"/>
+      <w:r>
+        <w:rPr>
+          <w:rFonts w:ascii="Times New Roman" w:eastAsia="Times New Roman" w:hAnsi="Times New Roman" w:cs="Times New Roman"/>
+          <w:b/>
+          <w:bCs/>
+          <w:color w:val="00B050"/>
+          <w:sz w:val="27"/>
+          <w:szCs w:val="27"/>
+        </w:rPr>
+        <w:t>sc</w:t>
+      </w:r>
+      <w:proofErr w:type="spellEnd"/>
+      <w:r>
+        <w:rPr>
+          <w:rFonts w:ascii="Times New Roman" w:eastAsia="Times New Roman" w:hAnsi="Times New Roman" w:cs="Times New Roman"/>
+          <w:b/>
+          <w:bCs/>
+          <w:color w:val="00B050"/>
+          <w:sz w:val="27"/>
+          <w:szCs w:val="27"/>
+        </w:rPr>
+        <w:t xml:space="preserve"> = new </w:t>
+      </w:r>
+      <w:proofErr w:type="gramStart"/>
+      <w:r>
+        <w:rPr>
+          <w:rFonts w:ascii="Times New Roman" w:eastAsia="Times New Roman" w:hAnsi="Times New Roman" w:cs="Times New Roman"/>
+          <w:b/>
+          <w:bCs/>
+          <w:color w:val="00B050"/>
+          <w:sz w:val="27"/>
+          <w:szCs w:val="27"/>
+        </w:rPr>
+        <w:t>Scanner(</w:t>
+      </w:r>
+      <w:proofErr w:type="gramEnd"/>
+      <w:r>
+        <w:rPr>
+          <w:rFonts w:ascii="Times New Roman" w:eastAsia="Times New Roman" w:hAnsi="Times New Roman" w:cs="Times New Roman"/>
+          <w:b/>
+          <w:bCs/>
+          <w:color w:val="00B050"/>
+          <w:sz w:val="27"/>
+          <w:szCs w:val="27"/>
+        </w:rPr>
+        <w:t>System.in) code will give a/an ______ error.</w:t>
+      </w:r>
+    </w:p>
+    <w:p>
+      <w:pPr>
+        <w:spacing w:before="100" w:beforeAutospacing="1" w:after="100" w:afterAutospacing="1" w:line="240" w:lineRule="auto"/>
+        <w:rPr>
+          <w:rFonts w:ascii="Times New Roman" w:eastAsia="Times New Roman" w:hAnsi="Times New Roman" w:cs="Times New Roman"/>
+          <w:sz w:val="24"/>
+          <w:szCs w:val="24"/>
+        </w:rPr>
+      </w:pPr>
+      <w:r>
+        <w:rPr>
+          <w:rFonts w:ascii="Times New Roman" w:eastAsia="Times New Roman" w:hAnsi="Times New Roman" w:cs="Times New Roman"/>
+          <w:sz w:val="24"/>
+          <w:szCs w:val="24"/>
+        </w:rPr>
+        <w:t>a. Syntax</w:t>
+      </w:r>
+      <w:r>
+        <w:rPr>
+          <w:rFonts w:ascii="Times New Roman" w:eastAsia="Times New Roman" w:hAnsi="Times New Roman" w:cs="Times New Roman"/>
+          <w:sz w:val="24"/>
+          <w:szCs w:val="24"/>
+        </w:rPr>
+        <w:br/>
+        <w:t>b. Runtime</w:t>
+      </w:r>
+      <w:r>
+        <w:rPr>
+          <w:rFonts w:ascii="Times New Roman" w:eastAsia="Times New Roman" w:hAnsi="Times New Roman" w:cs="Times New Roman"/>
+          <w:sz w:val="24"/>
+          <w:szCs w:val="24"/>
+        </w:rPr>
+        <w:br/>
+        <w:t>c. Logical</w:t>
+      </w:r>
+      <w:r>
+        <w:rPr>
+          <w:rFonts w:ascii="Times New Roman" w:eastAsia="Times New Roman" w:hAnsi="Times New Roman" w:cs="Times New Roman"/>
+          <w:sz w:val="24"/>
+          <w:szCs w:val="24"/>
+        </w:rPr>
+        <w:br/>
+        <w:t>d. None of these</w:t>
+      </w:r>
+    </w:p>
+    <w:p>
+      <w:pPr>
+        <w:spacing w:before="100" w:beforeAutospacing="1" w:after="100" w:afterAutospacing="1" w:line="240" w:lineRule="auto"/>
+        <w:rPr>
+          <w:rFonts w:ascii="Times New Roman" w:eastAsia="Times New Roman" w:hAnsi="Times New Roman" w:cs="Times New Roman"/>
+          <w:color w:val="FF0000"/>
+          <w:sz w:val="24"/>
+          <w:szCs w:val="24"/>
+        </w:rPr>
+      </w:pPr>
+      <w:r>
+        <w:rPr>
+          <w:rFonts w:ascii="Times New Roman" w:eastAsia="Times New Roman" w:hAnsi="Times New Roman" w:cs="Times New Roman"/>
+          <w:b/>
+          <w:bCs/>
+          <w:color w:val="FF0000"/>
+          <w:sz w:val="24"/>
+          <w:szCs w:val="24"/>
+        </w:rPr>
+        <w:t>Answer:</w:t>
+      </w:r>
+      <w:r>
+        <w:rPr>
+          <w:rFonts w:ascii="Times New Roman" w:eastAsia="Times New Roman" w:hAnsi="Times New Roman" w:cs="Times New Roman"/>
+          <w:color w:val="FF0000"/>
+          <w:sz w:val="24"/>
+          <w:szCs w:val="24"/>
+        </w:rPr>
+        <w:t xml:space="preserve"> a. Syntax </w:t>
+      </w:r>
+      <w:r>
+        <w:rPr>
+          <w:rFonts w:ascii="Times New Roman" w:eastAsia="Times New Roman" w:hAnsi="Times New Roman" w:cs="Times New Roman"/>
+          <w:i/>
+          <w:iCs/>
+          <w:color w:val="FF0000"/>
+          <w:sz w:val="24"/>
+          <w:szCs w:val="24"/>
+        </w:rPr>
+        <w:t>(missing semicolon)</w:t>
+      </w:r>
+    </w:p>
+    <w:p>
+      <w:pPr>
+        <w:spacing w:before="100" w:beforeAutospacing="1" w:after="100" w:afterAutospacing="1" w:line="240" w:lineRule="auto"/>
+        <w:outlineLvl w:val="2"/>
+        <w:rPr>
+          <w:rFonts w:ascii="Times New Roman" w:eastAsia="Times New Roman" w:hAnsi="Times New Roman" w:cs="Times New Roman"/>
+          <w:b/>
+          <w:bCs/>
+          <w:color w:val="00B050"/>
+          <w:sz w:val="27"/>
+          <w:szCs w:val="27"/>
+        </w:rPr>
+      </w:pPr>
+      <w:r>
+        <w:rPr>
+          <w:rFonts w:ascii="Times New Roman" w:eastAsia="Times New Roman" w:hAnsi="Times New Roman" w:cs="Times New Roman"/>
+          <w:b/>
+          <w:bCs/>
+          <w:color w:val="00B050"/>
+          <w:sz w:val="27"/>
+          <w:szCs w:val="27"/>
+        </w:rPr>
+        <w:t>Q3. ______ are non-executable statements used to explain the code.</w:t>
+      </w:r>
+    </w:p>
+    <w:p>
+      <w:pPr>
+        <w:spacing w:before="100" w:beforeAutospacing="1" w:after="100" w:afterAutospacing="1" w:line="240" w:lineRule="auto"/>
+        <w:rPr>
+          <w:rFonts w:ascii="Times New Roman" w:eastAsia="Times New Roman" w:hAnsi="Times New Roman" w:cs="Times New Roman"/>
+          <w:sz w:val="24"/>
+          <w:szCs w:val="24"/>
+        </w:rPr>
+      </w:pPr>
+      <w:r>
+        <w:rPr>
+          <w:rFonts w:ascii="Times New Roman" w:eastAsia="Times New Roman" w:hAnsi="Times New Roman" w:cs="Times New Roman"/>
+          <w:sz w:val="24"/>
+          <w:szCs w:val="24"/>
+        </w:rPr>
+        <w:t>a. Comments</w:t>
+      </w:r>
+      <w:r>
+        <w:rPr>
+          <w:rFonts w:ascii="Times New Roman" w:eastAsia="Times New Roman" w:hAnsi="Times New Roman" w:cs="Times New Roman"/>
+          <w:sz w:val="24"/>
+          <w:szCs w:val="24"/>
+        </w:rPr>
+        <w:br/>
+        <w:t>b. Errors</w:t>
+      </w:r>
+      <w:r>
+        <w:rPr>
+          <w:rFonts w:ascii="Times New Roman" w:eastAsia="Times New Roman" w:hAnsi="Times New Roman" w:cs="Times New Roman"/>
+          <w:sz w:val="24"/>
+          <w:szCs w:val="24"/>
+        </w:rPr>
+        <w:br/>
+        <w:t>c. Logical</w:t>
+      </w:r>
+      <w:r>
+        <w:rPr>
+          <w:rFonts w:ascii="Times New Roman" w:eastAsia="Times New Roman" w:hAnsi="Times New Roman" w:cs="Times New Roman"/>
+          <w:sz w:val="24"/>
+          <w:szCs w:val="24"/>
+        </w:rPr>
+        <w:br/>
+        <w:t>d. Keywords</w:t>
+      </w:r>
+    </w:p>
+    <w:p>
+      <w:pPr>
+        <w:spacing w:before="100" w:beforeAutospacing="1" w:after="100" w:afterAutospacing="1" w:line="240" w:lineRule="auto"/>
+        <w:rPr>
+          <w:rFonts w:ascii="Times New Roman" w:eastAsia="Times New Roman" w:hAnsi="Times New Roman" w:cs="Times New Roman"/>
+          <w:color w:val="FF0000"/>
+          <w:sz w:val="24"/>
+          <w:szCs w:val="24"/>
+        </w:rPr>
+      </w:pPr>
+      <w:r>
+        <w:rPr>
+          <w:rFonts w:ascii="Times New Roman" w:eastAsia="Times New Roman" w:hAnsi="Times New Roman" w:cs="Times New Roman"/>
+          <w:b/>
+          <w:bCs/>
+          <w:color w:val="FF0000"/>
+          <w:sz w:val="24"/>
+          <w:szCs w:val="24"/>
+        </w:rPr>
+        <w:t>Answer:</w:t>
+      </w:r>
+      <w:r>
+        <w:rPr>
+          <w:rFonts w:ascii="Times New Roman" w:eastAsia="Times New Roman" w:hAnsi="Times New Roman" w:cs="Times New Roman"/>
+          <w:color w:val="FF0000"/>
+          <w:sz w:val="24"/>
+          <w:szCs w:val="24"/>
+        </w:rPr>
+        <w:t xml:space="preserve"> a. Comments</w:t>
+      </w:r>
+    </w:p>
+    <w:p>
+      <w:pPr>
+        <w:spacing w:before="100" w:beforeAutospacing="1" w:after="100" w:afterAutospacing="1" w:line="240" w:lineRule="auto"/>
+        <w:outlineLvl w:val="2"/>
+        <w:rPr>
+          <w:rFonts w:ascii="Times New Roman" w:eastAsia="Times New Roman" w:hAnsi="Times New Roman" w:cs="Times New Roman"/>
+          <w:b/>
+          <w:bCs/>
+          <w:color w:val="00B050"/>
+          <w:sz w:val="27"/>
+          <w:szCs w:val="27"/>
+        </w:rPr>
+      </w:pPr>
+      <w:r>
+        <w:rPr>
+          <w:rFonts w:ascii="Times New Roman" w:eastAsia="Times New Roman" w:hAnsi="Times New Roman" w:cs="Times New Roman"/>
+          <w:b/>
+          <w:bCs/>
+          <w:color w:val="00B050"/>
+          <w:sz w:val="27"/>
+          <w:szCs w:val="27"/>
+        </w:rPr>
+        <w:t>Q4. Which of the following is NOT used to write a comment?</w:t>
+      </w:r>
+    </w:p>
+    <w:p>
+      <w:pPr>
+        <w:spacing w:before="100" w:beforeAutospacing="1" w:after="100" w:afterAutospacing="1" w:line="240" w:lineRule="auto"/>
+        <w:rPr>
+          <w:rFonts w:ascii="Times New Roman" w:eastAsia="Times New Roman" w:hAnsi="Times New Roman" w:cs="Times New Roman"/>
+          <w:sz w:val="24"/>
+          <w:szCs w:val="24"/>
+        </w:rPr>
+      </w:pPr>
+      <w:r>
+        <w:rPr>
+          <w:rFonts w:ascii="Times New Roman" w:eastAsia="Times New Roman" w:hAnsi="Times New Roman" w:cs="Times New Roman"/>
+          <w:sz w:val="24"/>
+          <w:szCs w:val="24"/>
+        </w:rPr>
+        <w:t>a. /**</w:t>
+      </w:r>
+      <w:r>
+        <w:rPr>
+          <w:rFonts w:ascii="Times New Roman" w:eastAsia="Times New Roman" w:hAnsi="Times New Roman" w:cs="Times New Roman"/>
+          <w:sz w:val="24"/>
+          <w:szCs w:val="24"/>
+        </w:rPr>
+        <w:br/>
+        <w:t>b. //</w:t>
+      </w:r>
+      <w:r>
+        <w:rPr>
+          <w:rFonts w:ascii="Times New Roman" w:eastAsia="Times New Roman" w:hAnsi="Times New Roman" w:cs="Times New Roman"/>
+          <w:sz w:val="24"/>
+          <w:szCs w:val="24"/>
+        </w:rPr>
+        <w:br/>
+        <w:t>c. /</w:t>
+      </w:r>
+      <w:r>
+        <w:rPr>
+          <w:rFonts w:ascii="Times New Roman" w:eastAsia="Times New Roman" w:hAnsi="Times New Roman" w:cs="Times New Roman"/>
+          <w:sz w:val="24"/>
+          <w:szCs w:val="24"/>
+        </w:rPr>
+        <w:br/>
+        <w:t>d. /*</w:t>
+      </w:r>
+    </w:p>
+    <w:p>
+      <w:pPr>
+        <w:spacing w:before="100" w:beforeAutospacing="1" w:after="100" w:afterAutospacing="1" w:line="240" w:lineRule="auto"/>
+        <w:rPr>
+          <w:rFonts w:ascii="Times New Roman" w:eastAsia="Times New Roman" w:hAnsi="Times New Roman" w:cs="Times New Roman"/>
+          <w:color w:val="FF0000"/>
+          <w:sz w:val="24"/>
+          <w:szCs w:val="24"/>
+        </w:rPr>
+      </w:pPr>
+      <w:r>
+        <w:rPr>
+          <w:rFonts w:ascii="Times New Roman" w:eastAsia="Times New Roman" w:hAnsi="Times New Roman" w:cs="Times New Roman"/>
+          <w:b/>
+          <w:bCs/>
+          <w:color w:val="FF0000"/>
+          <w:sz w:val="24"/>
+          <w:szCs w:val="24"/>
+        </w:rPr>
+        <w:t>Answer:</w:t>
+      </w:r>
+      <w:r>
+        <w:rPr>
+          <w:rFonts w:ascii="Times New Roman" w:eastAsia="Times New Roman" w:hAnsi="Times New Roman" w:cs="Times New Roman"/>
+          <w:color w:val="FF0000"/>
+          <w:sz w:val="24"/>
+          <w:szCs w:val="24"/>
+        </w:rPr>
+        <w:t xml:space="preserve"> c. /</w:t>
+      </w:r>
+    </w:p>
+    <w:p>
+      <w:pPr>
+        <w:spacing w:before="100" w:beforeAutospacing="1" w:after="100" w:afterAutospacing="1" w:line="240" w:lineRule="auto"/>
+        <w:outlineLvl w:val="2"/>
+        <w:rPr>
+          <w:rFonts w:ascii="Times New Roman" w:eastAsia="Times New Roman" w:hAnsi="Times New Roman" w:cs="Times New Roman"/>
+          <w:b/>
+          <w:bCs/>
+          <w:color w:val="00B050"/>
+          <w:sz w:val="27"/>
+          <w:szCs w:val="27"/>
+        </w:rPr>
+      </w:pPr>
+      <w:r>
+        <w:rPr>
+          <w:rFonts w:ascii="Times New Roman" w:eastAsia="Times New Roman" w:hAnsi="Times New Roman" w:cs="Times New Roman"/>
+          <w:b/>
+          <w:bCs/>
+          <w:color w:val="00B050"/>
+          <w:sz w:val="27"/>
+          <w:szCs w:val="27"/>
+        </w:rPr>
+        <w:lastRenderedPageBreak/>
+        <w:t>Q5. Which of the following is used to input a float value using Scanner class?</w:t>
+      </w:r>
+    </w:p>
+    <w:p>
+      <w:pPr>
+        <w:spacing w:before="100" w:beforeAutospacing="1" w:after="100" w:afterAutospacing="1" w:line="240" w:lineRule="auto"/>
+        <w:rPr>
+          <w:rFonts w:ascii="Times New Roman" w:eastAsia="Times New Roman" w:hAnsi="Times New Roman" w:cs="Times New Roman"/>
+          <w:sz w:val="24"/>
+          <w:szCs w:val="24"/>
+        </w:rPr>
+      </w:pPr>
+      <w:proofErr w:type="gramStart"/>
+      <w:r>
+        <w:rPr>
+          <w:rFonts w:ascii="Times New Roman" w:eastAsia="Times New Roman" w:hAnsi="Times New Roman" w:cs="Times New Roman"/>
+          <w:sz w:val="24"/>
+          <w:szCs w:val="24"/>
+        </w:rPr>
+        <w:t>a</w:t>
+      </w:r>
+      <w:proofErr w:type="gramEnd"/>
+      <w:r>
+        <w:rPr>
+          <w:rFonts w:ascii="Times New Roman" w:eastAsia="Times New Roman" w:hAnsi="Times New Roman" w:cs="Times New Roman"/>
+          <w:sz w:val="24"/>
+          <w:szCs w:val="24"/>
+        </w:rPr>
+        <w:t>. next()</w:t>
+      </w:r>
+      <w:r>
+        <w:rPr>
+          <w:rFonts w:ascii="Times New Roman" w:eastAsia="Times New Roman" w:hAnsi="Times New Roman" w:cs="Times New Roman"/>
+          <w:sz w:val="24"/>
+          <w:szCs w:val="24"/>
+        </w:rPr>
+        <w:br/>
+        <w:t xml:space="preserve">b. </w:t>
+      </w:r>
+      <w:proofErr w:type="spellStart"/>
+      <w:r>
+        <w:rPr>
+          <w:rFonts w:ascii="Times New Roman" w:eastAsia="Times New Roman" w:hAnsi="Times New Roman" w:cs="Times New Roman"/>
+          <w:sz w:val="24"/>
+          <w:szCs w:val="24"/>
+        </w:rPr>
+        <w:t>nextInt</w:t>
+      </w:r>
+      <w:proofErr w:type="spellEnd"/>
+      <w:r>
+        <w:rPr>
+          <w:rFonts w:ascii="Times New Roman" w:eastAsia="Times New Roman" w:hAnsi="Times New Roman" w:cs="Times New Roman"/>
+          <w:sz w:val="24"/>
+          <w:szCs w:val="24"/>
+        </w:rPr>
+        <w:t>()</w:t>
+      </w:r>
+      <w:r>
+        <w:rPr>
+          <w:rFonts w:ascii="Times New Roman" w:eastAsia="Times New Roman" w:hAnsi="Times New Roman" w:cs="Times New Roman"/>
+          <w:sz w:val="24"/>
+          <w:szCs w:val="24"/>
+        </w:rPr>
+        <w:br/>
+        <w:t xml:space="preserve">c. </w:t>
+      </w:r>
+      <w:proofErr w:type="spellStart"/>
+      <w:r>
+        <w:rPr>
+          <w:rFonts w:ascii="Times New Roman" w:eastAsia="Times New Roman" w:hAnsi="Times New Roman" w:cs="Times New Roman"/>
+          <w:sz w:val="24"/>
+          <w:szCs w:val="24"/>
+        </w:rPr>
+        <w:t>nextDouble</w:t>
+      </w:r>
+      <w:proofErr w:type="spellEnd"/>
+      <w:r>
+        <w:rPr>
+          <w:rFonts w:ascii="Times New Roman" w:eastAsia="Times New Roman" w:hAnsi="Times New Roman" w:cs="Times New Roman"/>
+          <w:sz w:val="24"/>
+          <w:szCs w:val="24"/>
+        </w:rPr>
+        <w:t>()</w:t>
+      </w:r>
+      <w:r>
+        <w:rPr>
+          <w:rFonts w:ascii="Times New Roman" w:eastAsia="Times New Roman" w:hAnsi="Times New Roman" w:cs="Times New Roman"/>
+          <w:sz w:val="24"/>
+          <w:szCs w:val="24"/>
+        </w:rPr>
+        <w:br/>
+        <w:t xml:space="preserve">d. </w:t>
+      </w:r>
+      <w:proofErr w:type="spellStart"/>
+      <w:r>
+        <w:rPr>
+          <w:rFonts w:ascii="Times New Roman" w:eastAsia="Times New Roman" w:hAnsi="Times New Roman" w:cs="Times New Roman"/>
+          <w:sz w:val="24"/>
+          <w:szCs w:val="24"/>
+        </w:rPr>
+        <w:t>nextFloat</w:t>
+      </w:r>
+      <w:proofErr w:type="spellEnd"/>
+      <w:r>
+        <w:rPr>
+          <w:rFonts w:ascii="Times New Roman" w:eastAsia="Times New Roman" w:hAnsi="Times New Roman" w:cs="Times New Roman"/>
+          <w:sz w:val="24"/>
+          <w:szCs w:val="24"/>
+        </w:rPr>
+        <w:t>()</w:t>
+      </w:r>
+    </w:p>
+    <w:p>
+      <w:pPr>
+        <w:spacing w:before="100" w:beforeAutospacing="1" w:after="100" w:afterAutospacing="1" w:line="240" w:lineRule="auto"/>
+        <w:rPr>
+          <w:rFonts w:ascii="Times New Roman" w:eastAsia="Times New Roman" w:hAnsi="Times New Roman" w:cs="Times New Roman"/>
+          <w:color w:val="FF0000"/>
+          <w:sz w:val="24"/>
+          <w:szCs w:val="24"/>
+        </w:rPr>
+      </w:pPr>
+      <w:r>
+        <w:rPr>
+          <w:rFonts w:ascii="Times New Roman" w:eastAsia="Times New Roman" w:hAnsi="Times New Roman" w:cs="Times New Roman"/>
+          <w:b/>
+          <w:bCs/>
+          <w:color w:val="FF0000"/>
+          <w:sz w:val="24"/>
+          <w:szCs w:val="24"/>
+        </w:rPr>
+        <w:t>Answer:</w:t>
+      </w:r>
+      <w:r>
+        <w:rPr>
+          <w:rFonts w:ascii="Times New Roman" w:eastAsia="Times New Roman" w:hAnsi="Times New Roman" w:cs="Times New Roman"/>
+          <w:color w:val="FF0000"/>
+          <w:sz w:val="24"/>
+          <w:szCs w:val="24"/>
+        </w:rPr>
+        <w:t xml:space="preserve"> d. </w:t>
+      </w:r>
+      <w:proofErr w:type="spellStart"/>
+      <w:proofErr w:type="gramStart"/>
+      <w:r>
+        <w:rPr>
+          <w:rFonts w:ascii="Times New Roman" w:eastAsia="Times New Roman" w:hAnsi="Times New Roman" w:cs="Times New Roman"/>
+          <w:color w:val="FF0000"/>
+          <w:sz w:val="24"/>
+          <w:szCs w:val="24"/>
+        </w:rPr>
+        <w:t>nextFloat</w:t>
+      </w:r>
+      <w:proofErr w:type="spellEnd"/>
+      <w:r>
+        <w:rPr>
+          <w:rFonts w:ascii="Times New Roman" w:eastAsia="Times New Roman" w:hAnsi="Times New Roman" w:cs="Times New Roman"/>
+          <w:color w:val="FF0000"/>
+          <w:sz w:val="24"/>
+          <w:szCs w:val="24"/>
+        </w:rPr>
+        <w:t>()</w:t>
+      </w:r>
+      <w:proofErr w:type="gramEnd"/>
+    </w:p>
+    <w:p>
+      <w:pPr>
+        <w:spacing w:before="100" w:beforeAutospacing="1" w:after="100" w:afterAutospacing="1" w:line="240" w:lineRule="auto"/>
+        <w:outlineLvl w:val="2"/>
+        <w:rPr>
+          <w:rFonts w:ascii="Times New Roman" w:eastAsia="Times New Roman" w:hAnsi="Times New Roman" w:cs="Times New Roman"/>
+          <w:b/>
+          <w:bCs/>
+          <w:color w:val="00B050"/>
+          <w:sz w:val="27"/>
+          <w:szCs w:val="27"/>
+        </w:rPr>
+      </w:pPr>
+      <w:r>
+        <w:rPr>
+          <w:rFonts w:ascii="Times New Roman" w:eastAsia="Times New Roman" w:hAnsi="Times New Roman" w:cs="Times New Roman"/>
+          <w:b/>
+          <w:bCs/>
+          <w:color w:val="00B050"/>
+          <w:sz w:val="27"/>
+          <w:szCs w:val="27"/>
+        </w:rPr>
+        <w:t>Q6. Which of the following is the correct way to initialize an integer variable x with value 10 in Java?</w:t>
+      </w:r>
+    </w:p>
+    <w:p>
+      <w:pPr>
+        <w:spacing w:before="100" w:beforeAutospacing="1" w:after="100" w:afterAutospacing="1" w:line="240" w:lineRule="auto"/>
+        <w:rPr>
+          <w:rFonts w:ascii="Times New Roman" w:eastAsia="Times New Roman" w:hAnsi="Times New Roman" w:cs="Times New Roman"/>
+          <w:sz w:val="24"/>
+          <w:szCs w:val="24"/>
+        </w:rPr>
+      </w:pPr>
+      <w:proofErr w:type="gramStart"/>
+      <w:r>
+        <w:rPr>
+          <w:rFonts w:ascii="Times New Roman" w:eastAsia="Times New Roman" w:hAnsi="Times New Roman" w:cs="Times New Roman"/>
+          <w:sz w:val="24"/>
+          <w:szCs w:val="24"/>
+        </w:rPr>
+        <w:t>a</w:t>
+      </w:r>
+      <w:proofErr w:type="gramEnd"/>
+      <w:r>
+        <w:rPr>
+          <w:rFonts w:ascii="Times New Roman" w:eastAsia="Times New Roman" w:hAnsi="Times New Roman" w:cs="Times New Roman"/>
+          <w:sz w:val="24"/>
+          <w:szCs w:val="24"/>
+        </w:rPr>
+        <w:t xml:space="preserve">. </w:t>
+      </w:r>
+      <w:proofErr w:type="spellStart"/>
+      <w:r>
+        <w:rPr>
+          <w:rFonts w:ascii="Times New Roman" w:eastAsia="Times New Roman" w:hAnsi="Times New Roman" w:cs="Times New Roman"/>
+          <w:sz w:val="24"/>
+          <w:szCs w:val="24"/>
+        </w:rPr>
+        <w:t>int</w:t>
+      </w:r>
+      <w:proofErr w:type="spellEnd"/>
+      <w:r>
+        <w:rPr>
+          <w:rFonts w:ascii="Times New Roman" w:eastAsia="Times New Roman" w:hAnsi="Times New Roman" w:cs="Times New Roman"/>
+          <w:sz w:val="24"/>
+          <w:szCs w:val="24"/>
+        </w:rPr>
+        <w:t xml:space="preserve"> x = 10;</w:t>
+      </w:r>
+      <w:r>
+        <w:rPr>
+          <w:rFonts w:ascii="Times New Roman" w:eastAsia="Times New Roman" w:hAnsi="Times New Roman" w:cs="Times New Roman"/>
+          <w:sz w:val="24"/>
+          <w:szCs w:val="24"/>
+        </w:rPr>
+        <w:br/>
+        <w:t xml:space="preserve">b. </w:t>
+      </w:r>
+      <w:proofErr w:type="spellStart"/>
+      <w:r>
+        <w:rPr>
+          <w:rFonts w:ascii="Times New Roman" w:eastAsia="Times New Roman" w:hAnsi="Times New Roman" w:cs="Times New Roman"/>
+          <w:sz w:val="24"/>
+          <w:szCs w:val="24"/>
+        </w:rPr>
+        <w:t>int</w:t>
+      </w:r>
+      <w:proofErr w:type="spellEnd"/>
+      <w:r>
+        <w:rPr>
+          <w:rFonts w:ascii="Times New Roman" w:eastAsia="Times New Roman" w:hAnsi="Times New Roman" w:cs="Times New Roman"/>
+          <w:sz w:val="24"/>
+          <w:szCs w:val="24"/>
+        </w:rPr>
+        <w:t xml:space="preserve"> x := 10;</w:t>
+      </w:r>
+      <w:r>
+        <w:rPr>
+          <w:rFonts w:ascii="Times New Roman" w:eastAsia="Times New Roman" w:hAnsi="Times New Roman" w:cs="Times New Roman"/>
+          <w:sz w:val="24"/>
+          <w:szCs w:val="24"/>
+        </w:rPr>
+        <w:br/>
+        <w:t>c. let x = 10;</w:t>
+      </w:r>
+      <w:r>
+        <w:rPr>
+          <w:rFonts w:ascii="Times New Roman" w:eastAsia="Times New Roman" w:hAnsi="Times New Roman" w:cs="Times New Roman"/>
+          <w:sz w:val="24"/>
+          <w:szCs w:val="24"/>
+        </w:rPr>
+        <w:br/>
+        <w:t>d. x = 10;</w:t>
+      </w:r>
+    </w:p>
+    <w:p>
+      <w:pPr>
+        <w:spacing w:before="100" w:beforeAutospacing="1" w:after="100" w:afterAutospacing="1" w:line="240" w:lineRule="auto"/>
+        <w:rPr>
+          <w:rFonts w:ascii="Times New Roman" w:eastAsia="Times New Roman" w:hAnsi="Times New Roman" w:cs="Times New Roman"/>
+          <w:color w:val="FF0000"/>
+          <w:sz w:val="24"/>
+          <w:szCs w:val="24"/>
+        </w:rPr>
+      </w:pPr>
+      <w:r>
+        <w:rPr>
+          <w:rFonts w:ascii="Times New Roman" w:eastAsia="Times New Roman" w:hAnsi="Times New Roman" w:cs="Times New Roman"/>
+          <w:b/>
+          <w:bCs/>
+          <w:color w:val="FF0000"/>
+          <w:sz w:val="24"/>
+          <w:szCs w:val="24"/>
+        </w:rPr>
+        <w:t>Answer:</w:t>
+      </w:r>
+      <w:r>
+        <w:rPr>
+          <w:rFonts w:ascii="Times New Roman" w:eastAsia="Times New Roman" w:hAnsi="Times New Roman" w:cs="Times New Roman"/>
+          <w:color w:val="FF0000"/>
+          <w:sz w:val="24"/>
+          <w:szCs w:val="24"/>
+        </w:rPr>
+        <w:t xml:space="preserve"> a. </w:t>
+      </w:r>
+      <w:proofErr w:type="spellStart"/>
+      <w:r>
+        <w:rPr>
+          <w:rFonts w:ascii="Times New Roman" w:eastAsia="Times New Roman" w:hAnsi="Times New Roman" w:cs="Times New Roman"/>
+          <w:color w:val="FF0000"/>
+          <w:sz w:val="24"/>
+          <w:szCs w:val="24"/>
+        </w:rPr>
+        <w:t>int</w:t>
+      </w:r>
+      <w:proofErr w:type="spellEnd"/>
+      <w:r>
+        <w:rPr>
+          <w:rFonts w:ascii="Times New Roman" w:eastAsia="Times New Roman" w:hAnsi="Times New Roman" w:cs="Times New Roman"/>
+          <w:color w:val="FF0000"/>
+          <w:sz w:val="24"/>
+          <w:szCs w:val="24"/>
+        </w:rPr>
+        <w:t xml:space="preserve"> x = 10;</w:t>
+      </w:r>
+    </w:p>
+    <w:p>
+      <w:pPr>
+        <w:spacing w:before="100" w:beforeAutospacing="1" w:after="100" w:afterAutospacing="1" w:line="240" w:lineRule="auto"/>
+        <w:outlineLvl w:val="2"/>
+        <w:rPr>
+          <w:rFonts w:ascii="Times New Roman" w:eastAsia="Times New Roman" w:hAnsi="Times New Roman" w:cs="Times New Roman"/>
+          <w:b/>
+          <w:bCs/>
+          <w:color w:val="00B050"/>
+          <w:sz w:val="27"/>
+          <w:szCs w:val="27"/>
+        </w:rPr>
+      </w:pPr>
+      <w:r>
+        <w:rPr>
+          <w:rFonts w:ascii="Times New Roman" w:eastAsia="Times New Roman" w:hAnsi="Times New Roman" w:cs="Times New Roman"/>
+          <w:b/>
+          <w:bCs/>
+          <w:color w:val="00B050"/>
+          <w:sz w:val="27"/>
+          <w:szCs w:val="27"/>
+        </w:rPr>
+        <w:t>Q7. Which of the following methods in Java is used to receive command-line arguments?</w:t>
+      </w:r>
+    </w:p>
+    <w:p>
+      <w:pPr>
+        <w:spacing w:before="100" w:beforeAutospacing="1" w:after="100" w:afterAutospacing="1" w:line="240" w:lineRule="auto"/>
+        <w:rPr>
+          <w:rFonts w:ascii="Times New Roman" w:eastAsia="Times New Roman" w:hAnsi="Times New Roman" w:cs="Times New Roman"/>
+          <w:sz w:val="24"/>
+          <w:szCs w:val="24"/>
+        </w:rPr>
+      </w:pPr>
+      <w:r>
+        <w:rPr>
+          <w:rFonts w:ascii="Times New Roman" w:eastAsia="Times New Roman" w:hAnsi="Times New Roman" w:cs="Times New Roman"/>
+          <w:sz w:val="24"/>
+          <w:szCs w:val="24"/>
+        </w:rPr>
+        <w:t>a. public static void start(</w:t>
+      </w:r>
+      <w:proofErr w:type="spellStart"/>
+      <w:r>
+        <w:rPr>
+          <w:rFonts w:ascii="Times New Roman" w:eastAsia="Times New Roman" w:hAnsi="Times New Roman" w:cs="Times New Roman"/>
+          <w:sz w:val="24"/>
+          <w:szCs w:val="24"/>
+        </w:rPr>
+        <w:t>int</w:t>
+      </w:r>
+      <w:proofErr w:type="spellEnd"/>
+      <w:r>
+        <w:rPr>
+          <w:rFonts w:ascii="Times New Roman" w:eastAsia="Times New Roman" w:hAnsi="Times New Roman" w:cs="Times New Roman"/>
+          <w:sz w:val="24"/>
+          <w:szCs w:val="24"/>
+        </w:rPr>
+        <w:t xml:space="preserve">[] </w:t>
+      </w:r>
+      <w:proofErr w:type="spellStart"/>
+      <w:r>
+        <w:rPr>
+          <w:rFonts w:ascii="Times New Roman" w:eastAsia="Times New Roman" w:hAnsi="Times New Roman" w:cs="Times New Roman"/>
+          <w:sz w:val="24"/>
+          <w:szCs w:val="24"/>
+        </w:rPr>
+        <w:t>args</w:t>
+      </w:r>
+      <w:proofErr w:type="spellEnd"/>
+      <w:r>
+        <w:rPr>
+          <w:rFonts w:ascii="Times New Roman" w:eastAsia="Times New Roman" w:hAnsi="Times New Roman" w:cs="Times New Roman"/>
+          <w:sz w:val="24"/>
+          <w:szCs w:val="24"/>
+        </w:rPr>
+        <w:t>)</w:t>
+      </w:r>
+      <w:r>
+        <w:rPr>
+          <w:rFonts w:ascii="Times New Roman" w:eastAsia="Times New Roman" w:hAnsi="Times New Roman" w:cs="Times New Roman"/>
+          <w:sz w:val="24"/>
+          <w:szCs w:val="24"/>
+        </w:rPr>
+        <w:br/>
+        <w:t xml:space="preserve">b. public static void start(String </w:t>
+      </w:r>
+      <w:proofErr w:type="spellStart"/>
+      <w:r>
+        <w:rPr>
+          <w:rFonts w:ascii="Times New Roman" w:eastAsia="Times New Roman" w:hAnsi="Times New Roman" w:cs="Times New Roman"/>
+          <w:sz w:val="24"/>
+          <w:szCs w:val="24"/>
+        </w:rPr>
+        <w:t>args</w:t>
+      </w:r>
+      <w:proofErr w:type="spellEnd"/>
+      <w:r>
+        <w:rPr>
+          <w:rFonts w:ascii="Times New Roman" w:eastAsia="Times New Roman" w:hAnsi="Times New Roman" w:cs="Times New Roman"/>
+          <w:sz w:val="24"/>
+          <w:szCs w:val="24"/>
+        </w:rPr>
+        <w:t>)</w:t>
+      </w:r>
+      <w:r>
+        <w:rPr>
+          <w:rFonts w:ascii="Times New Roman" w:eastAsia="Times New Roman" w:hAnsi="Times New Roman" w:cs="Times New Roman"/>
+          <w:sz w:val="24"/>
+          <w:szCs w:val="24"/>
+        </w:rPr>
+        <w:br/>
+        <w:t>c. public static void main(</w:t>
+      </w:r>
+      <w:proofErr w:type="spellStart"/>
+      <w:r>
+        <w:rPr>
+          <w:rFonts w:ascii="Times New Roman" w:eastAsia="Times New Roman" w:hAnsi="Times New Roman" w:cs="Times New Roman"/>
+          <w:sz w:val="24"/>
+          <w:szCs w:val="24"/>
+        </w:rPr>
+        <w:t>int</w:t>
+      </w:r>
+      <w:proofErr w:type="spellEnd"/>
+      <w:r>
+        <w:rPr>
+          <w:rFonts w:ascii="Times New Roman" w:eastAsia="Times New Roman" w:hAnsi="Times New Roman" w:cs="Times New Roman"/>
+          <w:sz w:val="24"/>
+          <w:szCs w:val="24"/>
+        </w:rPr>
+        <w:t xml:space="preserve"> </w:t>
+      </w:r>
+      <w:proofErr w:type="spellStart"/>
+      <w:r>
+        <w:rPr>
+          <w:rFonts w:ascii="Times New Roman" w:eastAsia="Times New Roman" w:hAnsi="Times New Roman" w:cs="Times New Roman"/>
+          <w:sz w:val="24"/>
+          <w:szCs w:val="24"/>
+        </w:rPr>
+        <w:t>args</w:t>
+      </w:r>
+      <w:proofErr w:type="spellEnd"/>
+      <w:r>
+        <w:rPr>
+          <w:rFonts w:ascii="Times New Roman" w:eastAsia="Times New Roman" w:hAnsi="Times New Roman" w:cs="Times New Roman"/>
+          <w:sz w:val="24"/>
+          <w:szCs w:val="24"/>
+        </w:rPr>
+        <w:t>)</w:t>
+      </w:r>
+      <w:r>
+        <w:rPr>
+          <w:rFonts w:ascii="Times New Roman" w:eastAsia="Times New Roman" w:hAnsi="Times New Roman" w:cs="Times New Roman"/>
+          <w:sz w:val="24"/>
+          <w:szCs w:val="24"/>
+        </w:rPr>
+        <w:br/>
+        <w:t xml:space="preserve">d. public static void main(String[] </w:t>
+      </w:r>
+      <w:proofErr w:type="spellStart"/>
+      <w:r>
+        <w:rPr>
+          <w:rFonts w:ascii="Times New Roman" w:eastAsia="Times New Roman" w:hAnsi="Times New Roman" w:cs="Times New Roman"/>
+          <w:sz w:val="24"/>
+          <w:szCs w:val="24"/>
+        </w:rPr>
+        <w:t>args</w:t>
+      </w:r>
+      <w:proofErr w:type="spellEnd"/>
+      <w:r>
+        <w:rPr>
+          <w:rFonts w:ascii="Times New Roman" w:eastAsia="Times New Roman" w:hAnsi="Times New Roman" w:cs="Times New Roman"/>
+          <w:sz w:val="24"/>
+          <w:szCs w:val="24"/>
+        </w:rPr>
+        <w:t>)</w:t>
+      </w:r>
+    </w:p>
+    <w:p>
+      <w:pPr>
+        <w:spacing w:before="100" w:beforeAutospacing="1" w:after="100" w:afterAutospacing="1" w:line="240" w:lineRule="auto"/>
+        <w:rPr>
+          <w:rFonts w:ascii="Times New Roman" w:eastAsia="Times New Roman" w:hAnsi="Times New Roman" w:cs="Times New Roman"/>
+          <w:color w:val="FF0000"/>
+          <w:sz w:val="24"/>
+          <w:szCs w:val="24"/>
+        </w:rPr>
+      </w:pPr>
+      <w:r>
+        <w:rPr>
+          <w:rFonts w:ascii="Times New Roman" w:eastAsia="Times New Roman" w:hAnsi="Times New Roman" w:cs="Times New Roman"/>
+          <w:b/>
+          <w:bCs/>
+          <w:color w:val="FF0000"/>
+          <w:sz w:val="24"/>
+          <w:szCs w:val="24"/>
+        </w:rPr>
+        <w:t>Answer:</w:t>
+      </w:r>
+      <w:r>
+        <w:rPr>
+          <w:rFonts w:ascii="Times New Roman" w:eastAsia="Times New Roman" w:hAnsi="Times New Roman" w:cs="Times New Roman"/>
+          <w:color w:val="FF0000"/>
+          <w:sz w:val="24"/>
+          <w:szCs w:val="24"/>
+        </w:rPr>
+        <w:t xml:space="preserve"> d. public static void </w:t>
+      </w:r>
+      <w:proofErr w:type="gramStart"/>
+      <w:r>
+        <w:rPr>
+          <w:rFonts w:ascii="Times New Roman" w:eastAsia="Times New Roman" w:hAnsi="Times New Roman" w:cs="Times New Roman"/>
+          <w:color w:val="FF0000"/>
+          <w:sz w:val="24"/>
+          <w:szCs w:val="24"/>
+        </w:rPr>
+        <w:t>main(</w:t>
+      </w:r>
+      <w:proofErr w:type="gramEnd"/>
+      <w:r>
+        <w:rPr>
+          <w:rFonts w:ascii="Times New Roman" w:eastAsia="Times New Roman" w:hAnsi="Times New Roman" w:cs="Times New Roman"/>
+          <w:color w:val="FF0000"/>
+          <w:sz w:val="24"/>
+          <w:szCs w:val="24"/>
+        </w:rPr>
+        <w:t xml:space="preserve">String[] </w:t>
+      </w:r>
+      <w:proofErr w:type="spellStart"/>
+      <w:r>
+        <w:rPr>
+          <w:rFonts w:ascii="Times New Roman" w:eastAsia="Times New Roman" w:hAnsi="Times New Roman" w:cs="Times New Roman"/>
+          <w:color w:val="FF0000"/>
+          <w:sz w:val="24"/>
+          <w:szCs w:val="24"/>
+        </w:rPr>
+        <w:t>args</w:t>
+      </w:r>
+      <w:proofErr w:type="spellEnd"/>
+      <w:r>
+        <w:rPr>
+          <w:rFonts w:ascii="Times New Roman" w:eastAsia="Times New Roman" w:hAnsi="Times New Roman" w:cs="Times New Roman"/>
+          <w:color w:val="FF0000"/>
+          <w:sz w:val="24"/>
+          <w:szCs w:val="24"/>
+        </w:rPr>
+        <w:t>)</w:t>
+      </w:r>
+    </w:p>
+    <w:p>
+      <w:pPr>
+        <w:spacing w:before="100" w:beforeAutospacing="1" w:after="100" w:afterAutospacing="1" w:line="240" w:lineRule="auto"/>
+        <w:outlineLvl w:val="2"/>
+        <w:rPr>
+          <w:rFonts w:ascii="Times New Roman" w:eastAsia="Times New Roman" w:hAnsi="Times New Roman" w:cs="Times New Roman"/>
+          <w:b/>
+          <w:bCs/>
+          <w:color w:val="00B050"/>
+          <w:sz w:val="27"/>
+          <w:szCs w:val="27"/>
+        </w:rPr>
+      </w:pPr>
+      <w:r>
+        <w:rPr>
+          <w:rFonts w:ascii="Times New Roman" w:eastAsia="Times New Roman" w:hAnsi="Times New Roman" w:cs="Times New Roman"/>
+          <w:b/>
+          <w:bCs/>
+          <w:color w:val="00B050"/>
+          <w:sz w:val="27"/>
+          <w:szCs w:val="27"/>
+        </w:rPr>
+        <w:t>Q8. Which package do you need to import to use the Scanner class in Java?</w:t>
+      </w:r>
+    </w:p>
+    <w:p>
+      <w:pPr>
+        <w:spacing w:before="100" w:beforeAutospacing="1" w:after="100" w:afterAutospacing="1" w:line="240" w:lineRule="auto"/>
+        <w:rPr>
+          <w:rFonts w:ascii="Times New Roman" w:eastAsia="Times New Roman" w:hAnsi="Times New Roman" w:cs="Times New Roman"/>
+          <w:sz w:val="24"/>
+          <w:szCs w:val="24"/>
+        </w:rPr>
+      </w:pPr>
+      <w:r>
+        <w:rPr>
+          <w:rFonts w:ascii="Times New Roman" w:eastAsia="Times New Roman" w:hAnsi="Times New Roman" w:cs="Times New Roman"/>
+          <w:sz w:val="24"/>
+          <w:szCs w:val="24"/>
+        </w:rPr>
+        <w:t>a. java.io</w:t>
+      </w:r>
+      <w:r>
+        <w:rPr>
+          <w:rFonts w:ascii="Times New Roman" w:eastAsia="Times New Roman" w:hAnsi="Times New Roman" w:cs="Times New Roman"/>
+          <w:sz w:val="24"/>
+          <w:szCs w:val="24"/>
+        </w:rPr>
+        <w:br/>
+        <w:t xml:space="preserve">b. </w:t>
+      </w:r>
+      <w:proofErr w:type="spellStart"/>
+      <w:r>
+        <w:rPr>
+          <w:rFonts w:ascii="Times New Roman" w:eastAsia="Times New Roman" w:hAnsi="Times New Roman" w:cs="Times New Roman"/>
+          <w:sz w:val="24"/>
+          <w:szCs w:val="24"/>
+        </w:rPr>
+        <w:t>java.util</w:t>
+      </w:r>
+      <w:proofErr w:type="spellEnd"/>
+      <w:r>
+        <w:rPr>
+          <w:rFonts w:ascii="Times New Roman" w:eastAsia="Times New Roman" w:hAnsi="Times New Roman" w:cs="Times New Roman"/>
+          <w:sz w:val="24"/>
+          <w:szCs w:val="24"/>
+        </w:rPr>
+        <w:br/>
+        <w:t xml:space="preserve">c. </w:t>
+      </w:r>
+      <w:proofErr w:type="spellStart"/>
+      <w:r>
+        <w:rPr>
+          <w:rFonts w:ascii="Times New Roman" w:eastAsia="Times New Roman" w:hAnsi="Times New Roman" w:cs="Times New Roman"/>
+          <w:sz w:val="24"/>
+          <w:szCs w:val="24"/>
+        </w:rPr>
+        <w:t>java.lang</w:t>
+      </w:r>
+      <w:proofErr w:type="spellEnd"/>
+      <w:r>
+        <w:rPr>
+          <w:rFonts w:ascii="Times New Roman" w:eastAsia="Times New Roman" w:hAnsi="Times New Roman" w:cs="Times New Roman"/>
+          <w:sz w:val="24"/>
+          <w:szCs w:val="24"/>
+        </w:rPr>
+        <w:br/>
+        <w:t>d. java.net</w:t>
+      </w:r>
+    </w:p>
+    <w:p>
+      <w:pPr>
+        <w:spacing w:before="100" w:beforeAutospacing="1" w:after="100" w:afterAutospacing="1" w:line="240" w:lineRule="auto"/>
+        <w:rPr>
+          <w:rFonts w:ascii="Times New Roman" w:eastAsia="Times New Roman" w:hAnsi="Times New Roman" w:cs="Times New Roman"/>
+          <w:color w:val="FF0000"/>
+          <w:sz w:val="24"/>
+          <w:szCs w:val="24"/>
+        </w:rPr>
+      </w:pPr>
+      <w:r>
+        <w:rPr>
+          <w:rFonts w:ascii="Times New Roman" w:eastAsia="Times New Roman" w:hAnsi="Times New Roman" w:cs="Times New Roman"/>
+          <w:b/>
+          <w:bCs/>
+          <w:color w:val="FF0000"/>
+          <w:sz w:val="24"/>
+          <w:szCs w:val="24"/>
+        </w:rPr>
+        <w:t>Answer:</w:t>
+      </w:r>
+      <w:r>
+        <w:rPr>
+          <w:rFonts w:ascii="Times New Roman" w:eastAsia="Times New Roman" w:hAnsi="Times New Roman" w:cs="Times New Roman"/>
+          <w:color w:val="FF0000"/>
+          <w:sz w:val="24"/>
+          <w:szCs w:val="24"/>
+        </w:rPr>
+        <w:t xml:space="preserve"> b. </w:t>
+      </w:r>
+      <w:proofErr w:type="spellStart"/>
+      <w:r>
+        <w:rPr>
+          <w:rFonts w:ascii="Times New Roman" w:eastAsia="Times New Roman" w:hAnsi="Times New Roman" w:cs="Times New Roman"/>
+          <w:color w:val="FF0000"/>
+          <w:sz w:val="24"/>
+          <w:szCs w:val="24"/>
+        </w:rPr>
+        <w:t>java.util</w:t>
+      </w:r>
+      <w:proofErr w:type="spellEnd"/>
+    </w:p>
+    <w:p>
+      <w:pPr>
+        <w:spacing w:before="100" w:beforeAutospacing="1" w:after="100" w:afterAutospacing="1" w:line="240" w:lineRule="auto"/>
+        <w:outlineLvl w:val="2"/>
+        <w:rPr>
+          <w:rFonts w:ascii="Times New Roman" w:eastAsia="Times New Roman" w:hAnsi="Times New Roman" w:cs="Times New Roman"/>
+          <w:b/>
+          <w:bCs/>
+          <w:color w:val="00B050"/>
+          <w:sz w:val="27"/>
+          <w:szCs w:val="27"/>
+        </w:rPr>
+      </w:pPr>
+      <w:r>
+        <w:rPr>
+          <w:rFonts w:ascii="Times New Roman" w:eastAsia="Times New Roman" w:hAnsi="Times New Roman" w:cs="Times New Roman"/>
+          <w:b/>
+          <w:bCs/>
+          <w:color w:val="00B050"/>
+          <w:sz w:val="27"/>
+          <w:szCs w:val="27"/>
+        </w:rPr>
+        <w:t>Q9. What is the output of the following code if input is: "25 4.5 Hello"</w:t>
+      </w:r>
+    </w:p>
+    <w:p>
+      <w:pPr>
+        <w:tabs>
+          <w:tab w:val="left" w:pos="916"/>
+          <w:tab w:val="left" w:pos="1832"/>
+          <w:tab w:val="left" w:pos="2748"/>
+          <w:tab w:val="left" w:pos="3664"/>
+          <w:tab w:val="left" w:pos="4580"/>
+          <w:tab w:val="left" w:pos="5496"/>
+          <w:tab w:val="left" w:pos="6412"/>
+          <w:tab w:val="left" w:pos="7328"/>
+          <w:tab w:val="left" w:pos="8244"/>
+          <w:tab w:val="left" w:pos="9160"/>
+          <w:tab w:val="left" w:pos="10076"/>
+          <w:tab w:val="left" w:pos="10992"/>
+          <w:tab w:val="left" w:pos="11908"/>
+          <w:tab w:val="left" w:pos="12824"/>
+          <w:tab w:val="left" w:pos="13740"/>
+          <w:tab w:val="left" w:pos="14656"/>
+        </w:tabs>
+        <w:spacing w:after="0" w:line="240" w:lineRule="auto"/>
+        <w:rPr>
+          <w:rFonts w:ascii="Courier New" w:eastAsia="Times New Roman" w:hAnsi="Courier New" w:cs="Courier New"/>
+          <w:sz w:val="20"/>
+          <w:szCs w:val="20"/>
+        </w:rPr>
+      </w:pPr>
+      <w:r>
+        <w:rPr>
+          <w:rFonts w:ascii="Courier New" w:eastAsia="Times New Roman" w:hAnsi="Courier New" w:cs="Courier New"/>
+          <w:sz w:val="20"/>
+          <w:szCs w:val="20"/>
+        </w:rPr>
+        <w:t xml:space="preserve">Scanner </w:t>
+      </w:r>
+      <w:proofErr w:type="spellStart"/>
+      <w:r>
+        <w:rPr>
+          <w:rFonts w:ascii="Courier New" w:eastAsia="Times New Roman" w:hAnsi="Courier New" w:cs="Courier New"/>
+          <w:sz w:val="20"/>
+          <w:szCs w:val="20"/>
+        </w:rPr>
+        <w:t>sc</w:t>
+      </w:r>
+      <w:proofErr w:type="spellEnd"/>
+      <w:r>
+        <w:rPr>
+          <w:rFonts w:ascii="Courier New" w:eastAsia="Times New Roman" w:hAnsi="Courier New" w:cs="Courier New"/>
+          <w:sz w:val="20"/>
+          <w:szCs w:val="20"/>
+        </w:rPr>
+        <w:t xml:space="preserve"> = new </w:t>
+      </w:r>
+      <w:proofErr w:type="gramStart"/>
+      <w:r>
+        <w:rPr>
+          <w:rFonts w:ascii="Courier New" w:eastAsia="Times New Roman" w:hAnsi="Courier New" w:cs="Courier New"/>
+          <w:sz w:val="20"/>
+          <w:szCs w:val="20"/>
+        </w:rPr>
+        <w:t>Scanner(</w:t>
+      </w:r>
+      <w:proofErr w:type="gramEnd"/>
+      <w:r>
+        <w:rPr>
+          <w:rFonts w:ascii="Courier New" w:eastAsia="Times New Roman" w:hAnsi="Courier New" w:cs="Courier New"/>
+          <w:sz w:val="20"/>
+          <w:szCs w:val="20"/>
+        </w:rPr>
+        <w:t>System.in);</w:t>
+      </w:r>
+      <w:r>
+        <w:rPr>
+          <w:rFonts w:ascii="Courier New" w:eastAsia="Times New Roman" w:hAnsi="Courier New" w:cs="Courier New"/>
+          <w:sz w:val="20"/>
+          <w:szCs w:val="20"/>
+        </w:rPr>
+        <w:br/>
+      </w:r>
+      <w:proofErr w:type="spellStart"/>
+      <w:r>
+        <w:rPr>
+          <w:rFonts w:ascii="Courier New" w:eastAsia="Times New Roman" w:hAnsi="Courier New" w:cs="Courier New"/>
+          <w:sz w:val="20"/>
+          <w:szCs w:val="20"/>
+        </w:rPr>
+        <w:t>int</w:t>
+      </w:r>
+      <w:proofErr w:type="spellEnd"/>
+      <w:r>
+        <w:rPr>
+          <w:rFonts w:ascii="Courier New" w:eastAsia="Times New Roman" w:hAnsi="Courier New" w:cs="Courier New"/>
+          <w:sz w:val="20"/>
+          <w:szCs w:val="20"/>
+        </w:rPr>
+        <w:t xml:space="preserve"> a = </w:t>
+      </w:r>
+      <w:proofErr w:type="spellStart"/>
+      <w:r>
+        <w:rPr>
+          <w:rFonts w:ascii="Courier New" w:eastAsia="Times New Roman" w:hAnsi="Courier New" w:cs="Courier New"/>
+          <w:sz w:val="20"/>
+          <w:szCs w:val="20"/>
+        </w:rPr>
+        <w:t>sc.nextInt</w:t>
+      </w:r>
+      <w:proofErr w:type="spellEnd"/>
+      <w:r>
+        <w:rPr>
+          <w:rFonts w:ascii="Courier New" w:eastAsia="Times New Roman" w:hAnsi="Courier New" w:cs="Courier New"/>
+          <w:sz w:val="20"/>
+          <w:szCs w:val="20"/>
+        </w:rPr>
+        <w:t>();</w:t>
+      </w:r>
+      <w:r>
+        <w:rPr>
+          <w:rFonts w:ascii="Courier New" w:eastAsia="Times New Roman" w:hAnsi="Courier New" w:cs="Courier New"/>
+          <w:sz w:val="20"/>
+          <w:szCs w:val="20"/>
+        </w:rPr>
+        <w:br/>
+        <w:t xml:space="preserve">double b = </w:t>
+      </w:r>
+      <w:proofErr w:type="spellStart"/>
+      <w:r>
+        <w:rPr>
+          <w:rFonts w:ascii="Courier New" w:eastAsia="Times New Roman" w:hAnsi="Courier New" w:cs="Courier New"/>
+          <w:sz w:val="20"/>
+          <w:szCs w:val="20"/>
+        </w:rPr>
+        <w:t>sc.nextDouble</w:t>
+      </w:r>
+      <w:proofErr w:type="spellEnd"/>
+      <w:r>
+        <w:rPr>
+          <w:rFonts w:ascii="Courier New" w:eastAsia="Times New Roman" w:hAnsi="Courier New" w:cs="Courier New"/>
+          <w:sz w:val="20"/>
+          <w:szCs w:val="20"/>
+        </w:rPr>
+        <w:t>();</w:t>
+      </w:r>
+      <w:r>
+        <w:rPr>
+          <w:rFonts w:ascii="Courier New" w:eastAsia="Times New Roman" w:hAnsi="Courier New" w:cs="Courier New"/>
+          <w:sz w:val="20"/>
+          <w:szCs w:val="20"/>
+        </w:rPr>
+        <w:br/>
+        <w:t xml:space="preserve">String c = </w:t>
+      </w:r>
+      <w:proofErr w:type="spellStart"/>
+      <w:r>
+        <w:rPr>
+          <w:rFonts w:ascii="Courier New" w:eastAsia="Times New Roman" w:hAnsi="Courier New" w:cs="Courier New"/>
+          <w:sz w:val="20"/>
+          <w:szCs w:val="20"/>
+        </w:rPr>
+        <w:t>sc.next</w:t>
+      </w:r>
+      <w:proofErr w:type="spellEnd"/>
+      <w:r>
+        <w:rPr>
+          <w:rFonts w:ascii="Courier New" w:eastAsia="Times New Roman" w:hAnsi="Courier New" w:cs="Courier New"/>
+          <w:sz w:val="20"/>
+          <w:szCs w:val="20"/>
+        </w:rPr>
+        <w:t>();</w:t>
+      </w:r>
+    </w:p>
+    <w:p>
+      <w:pPr>
+        <w:spacing w:before="100" w:beforeAutospacing="1" w:after="100" w:afterAutospacing="1" w:line="240" w:lineRule="auto"/>
+        <w:rPr>
+          <w:rFonts w:ascii="Times New Roman" w:eastAsia="Times New Roman" w:hAnsi="Times New Roman" w:cs="Times New Roman"/>
+          <w:sz w:val="24"/>
+          <w:szCs w:val="24"/>
+        </w:rPr>
+      </w:pPr>
+      <w:r>
+        <w:rPr>
+          <w:rFonts w:ascii="Times New Roman" w:eastAsia="Times New Roman" w:hAnsi="Times New Roman" w:cs="Times New Roman"/>
+          <w:b/>
+          <w:bCs/>
+          <w:color w:val="FF0000"/>
+          <w:sz w:val="24"/>
+          <w:szCs w:val="24"/>
+        </w:rPr>
+        <w:t>Answer</w:t>
+      </w:r>
+      <w:proofErr w:type="gramStart"/>
+      <w:r>
+        <w:rPr>
+          <w:rFonts w:ascii="Times New Roman" w:eastAsia="Times New Roman" w:hAnsi="Times New Roman" w:cs="Times New Roman"/>
+          <w:b/>
+          <w:bCs/>
+          <w:color w:val="FF0000"/>
+          <w:sz w:val="24"/>
+          <w:szCs w:val="24"/>
+        </w:rPr>
+        <w:t>:</w:t>
+      </w:r>
+      <w:proofErr w:type="gramEnd"/>
+      <w:r>
+        <w:rPr>
+          <w:rFonts w:ascii="Times New Roman" w:eastAsia="Times New Roman" w:hAnsi="Times New Roman" w:cs="Times New Roman"/>
+          <w:color w:val="FF0000"/>
+          <w:sz w:val="24"/>
+          <w:szCs w:val="24"/>
+        </w:rPr>
+        <w:br/>
+      </w:r>
+      <w:r>
+        <w:rPr>
+          <w:rFonts w:ascii="Times New Roman" w:eastAsia="Times New Roman" w:hAnsi="Times New Roman" w:cs="Times New Roman"/>
+          <w:sz w:val="24"/>
+          <w:szCs w:val="24"/>
+        </w:rPr>
+        <w:t>a = 25</w:t>
+      </w:r>
+      <w:r>
+        <w:rPr>
+          <w:rFonts w:ascii="Times New Roman" w:eastAsia="Times New Roman" w:hAnsi="Times New Roman" w:cs="Times New Roman"/>
+          <w:sz w:val="24"/>
+          <w:szCs w:val="24"/>
+        </w:rPr>
+        <w:br/>
+        <w:t>b = 4.5</w:t>
+      </w:r>
+      <w:r>
+        <w:rPr>
+          <w:rFonts w:ascii="Times New Roman" w:eastAsia="Times New Roman" w:hAnsi="Times New Roman" w:cs="Times New Roman"/>
+          <w:sz w:val="24"/>
+          <w:szCs w:val="24"/>
+        </w:rPr>
+        <w:br/>
+        <w:t>c = Hello</w:t>
+      </w:r>
+    </w:p>
+    <w:p>
+      <w:pPr>
+        <w:spacing w:before="100" w:beforeAutospacing="1" w:after="100" w:afterAutospacing="1" w:line="240" w:lineRule="auto"/>
+        <w:outlineLvl w:val="0"/>
+        <w:rPr>
+          <w:rFonts w:ascii="Times New Roman" w:eastAsia="Times New Roman" w:hAnsi="Times New Roman" w:cs="Times New Roman"/>
+          <w:b/>
+          <w:bCs/>
+          <w:color w:val="00B0F0"/>
+          <w:kern w:val="36"/>
+          <w:sz w:val="48"/>
+          <w:szCs w:val="48"/>
+        </w:rPr>
+      </w:pPr>
+      <w:r>
+        <w:rPr>
+          <w:rFonts w:ascii="Times New Roman" w:eastAsia="Times New Roman" w:hAnsi="Times New Roman" w:cs="Times New Roman"/>
+          <w:b/>
+          <w:bCs/>
+          <w:color w:val="00B0F0"/>
+          <w:kern w:val="36"/>
+          <w:sz w:val="48"/>
+          <w:szCs w:val="48"/>
+        </w:rPr>
+        <w:lastRenderedPageBreak/>
+        <w:t>B. Fill in the blanks</w:t>
+      </w:r>
+    </w:p>
+    <w:p>
+      <w:pPr>
+        <w:spacing w:before="100" w:beforeAutospacing="1" w:after="100" w:afterAutospacing="1" w:line="240" w:lineRule="auto"/>
+        <w:outlineLvl w:val="2"/>
+        <w:rPr>
+          <w:rFonts w:ascii="Times New Roman" w:eastAsia="Times New Roman" w:hAnsi="Times New Roman" w:cs="Times New Roman"/>
+          <w:b/>
+          <w:bCs/>
+          <w:color w:val="00B050"/>
+          <w:sz w:val="27"/>
+          <w:szCs w:val="27"/>
+        </w:rPr>
+      </w:pPr>
+      <w:r>
+        <w:rPr>
+          <w:rFonts w:ascii="Times New Roman" w:eastAsia="Times New Roman" w:hAnsi="Times New Roman" w:cs="Times New Roman"/>
+          <w:b/>
+          <w:bCs/>
+          <w:color w:val="00B050"/>
+          <w:sz w:val="27"/>
+          <w:szCs w:val="27"/>
+        </w:rPr>
+        <w:t>Q1. Forgetting to put a semicolon at the end of a statement is a type of ______ error.</w:t>
+      </w:r>
+    </w:p>
+    <w:p>
+      <w:pPr>
+        <w:spacing w:before="100" w:beforeAutospacing="1" w:after="100" w:afterAutospacing="1" w:line="240" w:lineRule="auto"/>
+        <w:rPr>
+          <w:rFonts w:ascii="Times New Roman" w:eastAsia="Times New Roman" w:hAnsi="Times New Roman" w:cs="Times New Roman"/>
+          <w:color w:val="FF0000"/>
+          <w:sz w:val="24"/>
+          <w:szCs w:val="24"/>
+        </w:rPr>
+      </w:pPr>
+      <w:r>
+        <w:rPr>
+          <w:rFonts w:ascii="Times New Roman" w:eastAsia="Times New Roman" w:hAnsi="Times New Roman" w:cs="Times New Roman"/>
+          <w:b/>
+          <w:bCs/>
+          <w:color w:val="FF0000"/>
+          <w:sz w:val="24"/>
+          <w:szCs w:val="24"/>
+        </w:rPr>
+        <w:t>Answer:</w:t>
+      </w:r>
+      <w:r>
+        <w:rPr>
+          <w:rFonts w:ascii="Times New Roman" w:eastAsia="Times New Roman" w:hAnsi="Times New Roman" w:cs="Times New Roman"/>
+          <w:color w:val="FF0000"/>
+          <w:sz w:val="24"/>
+          <w:szCs w:val="24"/>
+        </w:rPr>
+        <w:t xml:space="preserve"> Syntax</w:t>
+      </w:r>
+    </w:p>
+    <w:p>
+      <w:pPr>
+        <w:spacing w:before="100" w:beforeAutospacing="1" w:after="100" w:afterAutospacing="1" w:line="240" w:lineRule="auto"/>
+        <w:outlineLvl w:val="2"/>
+        <w:rPr>
+          <w:rFonts w:ascii="Times New Roman" w:eastAsia="Times New Roman" w:hAnsi="Times New Roman" w:cs="Times New Roman"/>
+          <w:b/>
+          <w:bCs/>
+          <w:color w:val="00B050"/>
+          <w:sz w:val="27"/>
+          <w:szCs w:val="27"/>
+        </w:rPr>
+      </w:pPr>
+      <w:r>
+        <w:rPr>
+          <w:rFonts w:ascii="Times New Roman" w:eastAsia="Times New Roman" w:hAnsi="Times New Roman" w:cs="Times New Roman"/>
+          <w:b/>
+          <w:bCs/>
+          <w:color w:val="00B050"/>
+          <w:sz w:val="27"/>
+          <w:szCs w:val="27"/>
+        </w:rPr>
+        <w:t xml:space="preserve">Q2. </w:t>
+      </w:r>
+      <w:proofErr w:type="gramStart"/>
+      <w:r>
+        <w:rPr>
+          <w:rFonts w:ascii="Times New Roman" w:eastAsia="Times New Roman" w:hAnsi="Times New Roman" w:cs="Times New Roman"/>
+          <w:b/>
+          <w:bCs/>
+          <w:color w:val="00B050"/>
+          <w:sz w:val="27"/>
+          <w:szCs w:val="27"/>
+        </w:rPr>
+        <w:t>An</w:t>
+      </w:r>
+      <w:proofErr w:type="gramEnd"/>
+      <w:r>
+        <w:rPr>
+          <w:rFonts w:ascii="Times New Roman" w:eastAsia="Times New Roman" w:hAnsi="Times New Roman" w:cs="Times New Roman"/>
+          <w:b/>
+          <w:bCs/>
+          <w:color w:val="00B050"/>
+          <w:sz w:val="27"/>
+          <w:szCs w:val="27"/>
+        </w:rPr>
+        <w:t xml:space="preserve"> ______ is a situation in which the execution of a program stops abnormally.</w:t>
+      </w:r>
+    </w:p>
+    <w:p>
+      <w:pPr>
+        <w:spacing w:before="100" w:beforeAutospacing="1" w:after="100" w:afterAutospacing="1" w:line="240" w:lineRule="auto"/>
+        <w:rPr>
+          <w:rFonts w:ascii="Times New Roman" w:eastAsia="Times New Roman" w:hAnsi="Times New Roman" w:cs="Times New Roman"/>
+          <w:color w:val="FF0000"/>
+          <w:sz w:val="24"/>
+          <w:szCs w:val="24"/>
+        </w:rPr>
+      </w:pPr>
+      <w:r>
+        <w:rPr>
+          <w:rFonts w:ascii="Times New Roman" w:eastAsia="Times New Roman" w:hAnsi="Times New Roman" w:cs="Times New Roman"/>
+          <w:b/>
+          <w:bCs/>
+          <w:color w:val="FF0000"/>
+          <w:sz w:val="24"/>
+          <w:szCs w:val="24"/>
+        </w:rPr>
+        <w:t>Answer:</w:t>
+      </w:r>
+      <w:r>
+        <w:rPr>
+          <w:rFonts w:ascii="Times New Roman" w:eastAsia="Times New Roman" w:hAnsi="Times New Roman" w:cs="Times New Roman"/>
+          <w:color w:val="FF0000"/>
+          <w:sz w:val="24"/>
+          <w:szCs w:val="24"/>
+        </w:rPr>
+        <w:t xml:space="preserve"> Runtime error</w:t>
+      </w:r>
+    </w:p>
+    <w:p>
+      <w:pPr>
+        <w:spacing w:before="100" w:beforeAutospacing="1" w:after="100" w:afterAutospacing="1" w:line="240" w:lineRule="auto"/>
+        <w:outlineLvl w:val="2"/>
+        <w:rPr>
+          <w:rFonts w:ascii="Times New Roman" w:eastAsia="Times New Roman" w:hAnsi="Times New Roman" w:cs="Times New Roman"/>
+          <w:b/>
+          <w:bCs/>
+          <w:color w:val="00B050"/>
+          <w:sz w:val="27"/>
+          <w:szCs w:val="27"/>
+        </w:rPr>
+      </w:pPr>
+      <w:r>
+        <w:rPr>
+          <w:rFonts w:ascii="Times New Roman" w:eastAsia="Times New Roman" w:hAnsi="Times New Roman" w:cs="Times New Roman"/>
+          <w:b/>
+          <w:bCs/>
+          <w:color w:val="00B050"/>
+          <w:sz w:val="27"/>
+          <w:szCs w:val="27"/>
+        </w:rPr>
+        <w:t xml:space="preserve">Q3. ______ </w:t>
+      </w:r>
+      <w:proofErr w:type="gramStart"/>
+      <w:r>
+        <w:rPr>
+          <w:rFonts w:ascii="Times New Roman" w:eastAsia="Times New Roman" w:hAnsi="Times New Roman" w:cs="Times New Roman"/>
+          <w:b/>
+          <w:bCs/>
+          <w:color w:val="00B050"/>
+          <w:sz w:val="27"/>
+          <w:szCs w:val="27"/>
+        </w:rPr>
+        <w:t>errors</w:t>
+      </w:r>
+      <w:proofErr w:type="gramEnd"/>
+      <w:r>
+        <w:rPr>
+          <w:rFonts w:ascii="Times New Roman" w:eastAsia="Times New Roman" w:hAnsi="Times New Roman" w:cs="Times New Roman"/>
+          <w:b/>
+          <w:bCs/>
+          <w:color w:val="00B050"/>
+          <w:sz w:val="27"/>
+          <w:szCs w:val="27"/>
+        </w:rPr>
+        <w:t xml:space="preserve"> are also called semantic errors.</w:t>
+      </w:r>
+    </w:p>
+    <w:p>
+      <w:pPr>
+        <w:spacing w:before="100" w:beforeAutospacing="1" w:after="100" w:afterAutospacing="1" w:line="240" w:lineRule="auto"/>
+        <w:rPr>
+          <w:rFonts w:ascii="Times New Roman" w:eastAsia="Times New Roman" w:hAnsi="Times New Roman" w:cs="Times New Roman"/>
+          <w:color w:val="FF0000"/>
+          <w:sz w:val="24"/>
+          <w:szCs w:val="24"/>
+        </w:rPr>
+      </w:pPr>
+      <w:r>
+        <w:rPr>
+          <w:rFonts w:ascii="Times New Roman" w:eastAsia="Times New Roman" w:hAnsi="Times New Roman" w:cs="Times New Roman"/>
+          <w:b/>
+          <w:bCs/>
+          <w:color w:val="FF0000"/>
+          <w:sz w:val="24"/>
+          <w:szCs w:val="24"/>
+        </w:rPr>
+        <w:t>Answer:</w:t>
+      </w:r>
+      <w:r>
+        <w:rPr>
+          <w:rFonts w:ascii="Times New Roman" w:eastAsia="Times New Roman" w:hAnsi="Times New Roman" w:cs="Times New Roman"/>
+          <w:color w:val="FF0000"/>
+          <w:sz w:val="24"/>
+          <w:szCs w:val="24"/>
+        </w:rPr>
+        <w:t xml:space="preserve"> Logical</w:t>
+      </w:r>
+    </w:p>
+    <w:p>
+      <w:pPr>
+        <w:spacing w:before="100" w:beforeAutospacing="1" w:after="100" w:afterAutospacing="1" w:line="240" w:lineRule="auto"/>
+        <w:outlineLvl w:val="2"/>
+        <w:rPr>
+          <w:rFonts w:ascii="Times New Roman" w:eastAsia="Times New Roman" w:hAnsi="Times New Roman" w:cs="Times New Roman"/>
+          <w:b/>
+          <w:bCs/>
+          <w:color w:val="00B050"/>
+          <w:sz w:val="27"/>
+          <w:szCs w:val="27"/>
+        </w:rPr>
+      </w:pPr>
+      <w:r>
+        <w:rPr>
+          <w:rFonts w:ascii="Times New Roman" w:eastAsia="Times New Roman" w:hAnsi="Times New Roman" w:cs="Times New Roman"/>
+          <w:b/>
+          <w:bCs/>
+          <w:color w:val="00B050"/>
+          <w:sz w:val="27"/>
+          <w:szCs w:val="27"/>
+        </w:rPr>
+        <w:t>Q4. In Java, the ______ class is commonly used to read input from the user, and it includes methods such as ______ and ______ for reading different types of data.</w:t>
+      </w:r>
+    </w:p>
+    <w:p>
+      <w:pPr>
+        <w:spacing w:before="100" w:beforeAutospacing="1" w:after="100" w:afterAutospacing="1" w:line="240" w:lineRule="auto"/>
+        <w:rPr>
+          <w:rFonts w:ascii="Times New Roman" w:eastAsia="Times New Roman" w:hAnsi="Times New Roman" w:cs="Times New Roman"/>
+          <w:color w:val="FF0000"/>
+          <w:sz w:val="24"/>
+          <w:szCs w:val="24"/>
+        </w:rPr>
+      </w:pPr>
+      <w:r>
+        <w:rPr>
+          <w:rFonts w:ascii="Times New Roman" w:eastAsia="Times New Roman" w:hAnsi="Times New Roman" w:cs="Times New Roman"/>
+          <w:b/>
+          <w:bCs/>
+          <w:color w:val="FF0000"/>
+          <w:sz w:val="24"/>
+          <w:szCs w:val="24"/>
+        </w:rPr>
+        <w:t>Answer</w:t>
+      </w:r>
+      <w:proofErr w:type="gramStart"/>
+      <w:r>
+        <w:rPr>
+          <w:rFonts w:ascii="Times New Roman" w:eastAsia="Times New Roman" w:hAnsi="Times New Roman" w:cs="Times New Roman"/>
+          <w:b/>
+          <w:bCs/>
+          <w:color w:val="FF0000"/>
+          <w:sz w:val="24"/>
+          <w:szCs w:val="24"/>
+        </w:rPr>
+        <w:t>:</w:t>
+      </w:r>
+      <w:proofErr w:type="gramEnd"/>
+      <w:r>
+        <w:rPr>
+          <w:rFonts w:ascii="Times New Roman" w:eastAsia="Times New Roman" w:hAnsi="Times New Roman" w:cs="Times New Roman"/>
+          <w:color w:val="FF0000"/>
+          <w:sz w:val="24"/>
+          <w:szCs w:val="24"/>
+        </w:rPr>
+        <w:br/>
+        <w:t xml:space="preserve">Scanner, </w:t>
+      </w:r>
+      <w:proofErr w:type="spellStart"/>
+      <w:r>
+        <w:rPr>
+          <w:rFonts w:ascii="Times New Roman" w:eastAsia="Times New Roman" w:hAnsi="Times New Roman" w:cs="Times New Roman"/>
+          <w:color w:val="FF0000"/>
+          <w:sz w:val="24"/>
+          <w:szCs w:val="24"/>
+        </w:rPr>
+        <w:t>nextInt</w:t>
+      </w:r>
+      <w:proofErr w:type="spellEnd"/>
+      <w:r>
+        <w:rPr>
+          <w:rFonts w:ascii="Times New Roman" w:eastAsia="Times New Roman" w:hAnsi="Times New Roman" w:cs="Times New Roman"/>
+          <w:color w:val="FF0000"/>
+          <w:sz w:val="24"/>
+          <w:szCs w:val="24"/>
+        </w:rPr>
+        <w:t xml:space="preserve">(), </w:t>
+      </w:r>
+      <w:proofErr w:type="spellStart"/>
+      <w:r>
+        <w:rPr>
+          <w:rFonts w:ascii="Times New Roman" w:eastAsia="Times New Roman" w:hAnsi="Times New Roman" w:cs="Times New Roman"/>
+          <w:color w:val="FF0000"/>
+          <w:sz w:val="24"/>
+          <w:szCs w:val="24"/>
+        </w:rPr>
+        <w:t>nextDouble</w:t>
+      </w:r>
+      <w:proofErr w:type="spellEnd"/>
+      <w:r>
+        <w:rPr>
+          <w:rFonts w:ascii="Times New Roman" w:eastAsia="Times New Roman" w:hAnsi="Times New Roman" w:cs="Times New Roman"/>
+          <w:color w:val="FF0000"/>
+          <w:sz w:val="24"/>
+          <w:szCs w:val="24"/>
+        </w:rPr>
+        <w:t>()</w:t>
+      </w:r>
+    </w:p>
+    <w:p>
+      <w:pPr>
+        <w:spacing w:before="100" w:beforeAutospacing="1" w:after="100" w:afterAutospacing="1" w:line="240" w:lineRule="auto"/>
+        <w:outlineLvl w:val="2"/>
+        <w:rPr>
+          <w:rFonts w:ascii="Times New Roman" w:eastAsia="Times New Roman" w:hAnsi="Times New Roman" w:cs="Times New Roman"/>
+          <w:b/>
+          <w:bCs/>
+          <w:color w:val="00B050"/>
+          <w:sz w:val="27"/>
+          <w:szCs w:val="27"/>
+        </w:rPr>
+      </w:pPr>
+      <w:r>
+        <w:rPr>
+          <w:rFonts w:ascii="Times New Roman" w:eastAsia="Times New Roman" w:hAnsi="Times New Roman" w:cs="Times New Roman"/>
+          <w:b/>
+          <w:bCs/>
+          <w:color w:val="00B050"/>
+          <w:sz w:val="27"/>
+          <w:szCs w:val="27"/>
+        </w:rPr>
+        <w:t xml:space="preserve">Q5. We use ______ arguments to input values in String format in the </w:t>
+      </w:r>
+      <w:proofErr w:type="gramStart"/>
+      <w:r>
+        <w:rPr>
+          <w:rFonts w:ascii="Times New Roman" w:eastAsia="Times New Roman" w:hAnsi="Times New Roman" w:cs="Times New Roman"/>
+          <w:b/>
+          <w:bCs/>
+          <w:color w:val="00B050"/>
+          <w:sz w:val="27"/>
+          <w:szCs w:val="27"/>
+        </w:rPr>
+        <w:t>main(</w:t>
+      </w:r>
+      <w:proofErr w:type="gramEnd"/>
+      <w:r>
+        <w:rPr>
+          <w:rFonts w:ascii="Times New Roman" w:eastAsia="Times New Roman" w:hAnsi="Times New Roman" w:cs="Times New Roman"/>
+          <w:b/>
+          <w:bCs/>
+          <w:color w:val="00B050"/>
+          <w:sz w:val="27"/>
+          <w:szCs w:val="27"/>
+        </w:rPr>
+        <w:t>) method.</w:t>
+      </w:r>
+    </w:p>
+    <w:p>
+      <w:pPr>
+        <w:spacing w:before="100" w:beforeAutospacing="1" w:after="100" w:afterAutospacing="1" w:line="240" w:lineRule="auto"/>
+        <w:rPr>
+          <w:rFonts w:ascii="Times New Roman" w:eastAsia="Times New Roman" w:hAnsi="Times New Roman" w:cs="Times New Roman"/>
+          <w:color w:val="FF0000"/>
+          <w:sz w:val="24"/>
+          <w:szCs w:val="24"/>
+        </w:rPr>
+      </w:pPr>
+      <w:r>
+        <w:rPr>
+          <w:rFonts w:ascii="Times New Roman" w:eastAsia="Times New Roman" w:hAnsi="Times New Roman" w:cs="Times New Roman"/>
+          <w:b/>
+          <w:bCs/>
+          <w:color w:val="FF0000"/>
+          <w:sz w:val="24"/>
+          <w:szCs w:val="24"/>
+        </w:rPr>
+        <w:t>Answer:</w:t>
+      </w:r>
+      <w:r>
+        <w:rPr>
+          <w:rFonts w:ascii="Times New Roman" w:eastAsia="Times New Roman" w:hAnsi="Times New Roman" w:cs="Times New Roman"/>
+          <w:color w:val="FF0000"/>
+          <w:sz w:val="24"/>
+          <w:szCs w:val="24"/>
+        </w:rPr>
+        <w:t xml:space="preserve"> Command-line</w:t>
+      </w:r>
+    </w:p>
+    <w:p>
+      <w:pPr>
+        <w:spacing w:before="100" w:beforeAutospacing="1" w:after="100" w:afterAutospacing="1" w:line="240" w:lineRule="auto"/>
+        <w:outlineLvl w:val="0"/>
+        <w:rPr>
+          <w:rFonts w:ascii="Times New Roman" w:eastAsia="Times New Roman" w:hAnsi="Times New Roman" w:cs="Times New Roman"/>
+          <w:b/>
+          <w:bCs/>
+          <w:color w:val="00B0F0"/>
+          <w:kern w:val="36"/>
+          <w:sz w:val="48"/>
+          <w:szCs w:val="48"/>
+        </w:rPr>
+      </w:pPr>
+      <w:r>
+        <w:rPr>
+          <w:rFonts w:ascii="Times New Roman" w:eastAsia="Times New Roman" w:hAnsi="Times New Roman" w:cs="Times New Roman"/>
+          <w:b/>
+          <w:bCs/>
+          <w:color w:val="00B0F0"/>
+          <w:kern w:val="36"/>
+          <w:sz w:val="48"/>
+          <w:szCs w:val="48"/>
+        </w:rPr>
+        <w:t>C. Answer the following questions</w:t>
+      </w:r>
+    </w:p>
+    <w:p>
+      <w:pPr>
+        <w:spacing w:before="100" w:beforeAutospacing="1" w:after="100" w:afterAutospacing="1" w:line="240" w:lineRule="auto"/>
+        <w:outlineLvl w:val="2"/>
+        <w:rPr>
+          <w:rFonts w:ascii="Times New Roman" w:eastAsia="Times New Roman" w:hAnsi="Times New Roman" w:cs="Times New Roman"/>
+          <w:b/>
+          <w:bCs/>
+          <w:color w:val="00B050"/>
+          <w:sz w:val="27"/>
+          <w:szCs w:val="27"/>
+        </w:rPr>
+      </w:pPr>
+      <w:r>
+        <w:rPr>
+          <w:rFonts w:ascii="Times New Roman" w:eastAsia="Times New Roman" w:hAnsi="Times New Roman" w:cs="Times New Roman"/>
+          <w:b/>
+          <w:bCs/>
+          <w:color w:val="00B050"/>
+          <w:sz w:val="27"/>
+          <w:szCs w:val="27"/>
+        </w:rPr>
+        <w:t>Q1. What is the difference between multiline comments and documentation comments?</w:t>
+      </w:r>
+    </w:p>
+    <w:p>
+      <w:pPr>
+        <w:spacing w:before="100" w:beforeAutospacing="1" w:after="100" w:afterAutospacing="1" w:line="240" w:lineRule="auto"/>
+        <w:rPr>
+          <w:rFonts w:ascii="Times New Roman" w:eastAsia="Times New Roman" w:hAnsi="Times New Roman" w:cs="Times New Roman"/>
+          <w:color w:val="FF0000"/>
+          <w:sz w:val="24"/>
+          <w:szCs w:val="24"/>
+        </w:rPr>
+      </w:pPr>
+      <w:r>
+        <w:rPr>
+          <w:rFonts w:ascii="Times New Roman" w:eastAsia="Times New Roman" w:hAnsi="Times New Roman" w:cs="Times New Roman"/>
+          <w:b/>
+          <w:bCs/>
+          <w:color w:val="FF0000"/>
+          <w:sz w:val="24"/>
+          <w:szCs w:val="24"/>
+        </w:rPr>
+        <w:t>Answer:</w:t>
+      </w:r>
+    </w:p>
+    <w:p>
+      <w:pPr>
+        <w:numPr>
+          <w:ilvl w:val="0"/>
+          <w:numId w:val="1"/>
+        </w:numPr>
+        <w:spacing w:before="100" w:beforeAutospacing="1" w:after="100" w:afterAutospacing="1" w:line="240" w:lineRule="auto"/>
+        <w:rPr>
+          <w:rFonts w:ascii="Times New Roman" w:eastAsia="Times New Roman" w:hAnsi="Times New Roman" w:cs="Times New Roman"/>
+          <w:sz w:val="24"/>
+          <w:szCs w:val="24"/>
+        </w:rPr>
+      </w:pPr>
+      <w:r>
+        <w:rPr>
+          <w:rFonts w:ascii="Times New Roman" w:eastAsia="Times New Roman" w:hAnsi="Times New Roman" w:cs="Times New Roman"/>
+          <w:b/>
+          <w:bCs/>
+          <w:sz w:val="24"/>
+          <w:szCs w:val="24"/>
+        </w:rPr>
+        <w:t>Multiline comment:</w:t>
+      </w:r>
+      <w:r>
+        <w:rPr>
+          <w:rFonts w:ascii="Times New Roman" w:eastAsia="Times New Roman" w:hAnsi="Times New Roman" w:cs="Times New Roman"/>
+          <w:sz w:val="24"/>
+          <w:szCs w:val="24"/>
+        </w:rPr>
+        <w:t xml:space="preserve"> Used to comment multiple lines → </w:t>
+      </w:r>
+      <w:r>
+        <w:rPr>
+          <w:rFonts w:ascii="Courier New" w:eastAsia="Times New Roman" w:hAnsi="Courier New" w:cs="Courier New"/>
+          <w:sz w:val="20"/>
+          <w:szCs w:val="20"/>
+        </w:rPr>
+        <w:t>/* ... */</w:t>
+      </w:r>
+      <w:r>
+        <w:rPr>
+          <w:rFonts w:ascii="Times New Roman" w:eastAsia="Times New Roman" w:hAnsi="Times New Roman" w:cs="Times New Roman"/>
+          <w:sz w:val="24"/>
+          <w:szCs w:val="24"/>
+        </w:rPr>
+        <w:t xml:space="preserve"> </w:t>
+      </w:r>
+    </w:p>
+    <w:p>
+      <w:pPr>
+        <w:numPr>
+          <w:ilvl w:val="0"/>
+          <w:numId w:val="1"/>
+        </w:numPr>
+        <w:spacing w:before="100" w:beforeAutospacing="1" w:after="100" w:afterAutospacing="1" w:line="240" w:lineRule="auto"/>
+        <w:rPr>
+          <w:rFonts w:ascii="Times New Roman" w:eastAsia="Times New Roman" w:hAnsi="Times New Roman" w:cs="Times New Roman"/>
+          <w:sz w:val="24"/>
+          <w:szCs w:val="24"/>
+        </w:rPr>
+      </w:pPr>
+      <w:r>
+        <w:rPr>
+          <w:rFonts w:ascii="Times New Roman" w:eastAsia="Times New Roman" w:hAnsi="Times New Roman" w:cs="Times New Roman"/>
+          <w:b/>
+          <w:bCs/>
+          <w:sz w:val="24"/>
+          <w:szCs w:val="24"/>
+        </w:rPr>
+        <w:t>Documentation comment:</w:t>
+      </w:r>
+      <w:r>
+        <w:rPr>
+          <w:rFonts w:ascii="Times New Roman" w:eastAsia="Times New Roman" w:hAnsi="Times New Roman" w:cs="Times New Roman"/>
+          <w:sz w:val="24"/>
+          <w:szCs w:val="24"/>
+        </w:rPr>
+        <w:t xml:space="preserve"> Used for documentation of classes/methods → </w:t>
+      </w:r>
+      <w:r>
+        <w:rPr>
+          <w:rFonts w:ascii="Courier New" w:eastAsia="Times New Roman" w:hAnsi="Courier New" w:cs="Courier New"/>
+          <w:sz w:val="20"/>
+          <w:szCs w:val="20"/>
+        </w:rPr>
+        <w:t>/** ... */</w:t>
+      </w:r>
+      <w:r>
+        <w:rPr>
+          <w:rFonts w:ascii="Times New Roman" w:eastAsia="Times New Roman" w:hAnsi="Times New Roman" w:cs="Times New Roman"/>
+          <w:sz w:val="24"/>
+          <w:szCs w:val="24"/>
+        </w:rPr>
+        <w:t xml:space="preserve"> </w:t>
+      </w:r>
+    </w:p>
+    <w:p>
+      <w:pPr>
+        <w:spacing w:before="100" w:beforeAutospacing="1" w:after="100" w:afterAutospacing="1" w:line="240" w:lineRule="auto"/>
+        <w:outlineLvl w:val="2"/>
+        <w:rPr>
+          <w:rFonts w:ascii="Times New Roman" w:eastAsia="Times New Roman" w:hAnsi="Times New Roman" w:cs="Times New Roman"/>
+          <w:b/>
+          <w:bCs/>
+          <w:color w:val="00B050"/>
+          <w:sz w:val="27"/>
+          <w:szCs w:val="27"/>
+        </w:rPr>
+      </w:pPr>
+      <w:r>
+        <w:rPr>
+          <w:rFonts w:ascii="Times New Roman" w:eastAsia="Times New Roman" w:hAnsi="Times New Roman" w:cs="Times New Roman"/>
+          <w:b/>
+          <w:bCs/>
+          <w:color w:val="00B050"/>
+          <w:sz w:val="27"/>
+          <w:szCs w:val="27"/>
+        </w:rPr>
+        <w:t>Q2. Write the syntax to input a short type value using Scanner class.</w:t>
+      </w:r>
+    </w:p>
+    <w:p>
+      <w:pPr>
+        <w:spacing w:before="100" w:beforeAutospacing="1" w:after="100" w:afterAutospacing="1" w:line="240" w:lineRule="auto"/>
+        <w:rPr>
+          <w:rFonts w:ascii="Times New Roman" w:eastAsia="Times New Roman" w:hAnsi="Times New Roman" w:cs="Times New Roman"/>
+          <w:color w:val="FF0000"/>
+          <w:sz w:val="24"/>
+          <w:szCs w:val="24"/>
+        </w:rPr>
+      </w:pPr>
+      <w:r>
+        <w:rPr>
+          <w:rFonts w:ascii="Times New Roman" w:eastAsia="Times New Roman" w:hAnsi="Times New Roman" w:cs="Times New Roman"/>
+          <w:b/>
+          <w:bCs/>
+          <w:color w:val="FF0000"/>
+          <w:sz w:val="24"/>
+          <w:szCs w:val="24"/>
+        </w:rPr>
+        <w:t>Answer:</w:t>
+      </w:r>
+    </w:p>
+    <w:p>
+      <w:pPr>
+        <w:tabs>
+          <w:tab w:val="left" w:pos="916"/>
+          <w:tab w:val="left" w:pos="1832"/>
+          <w:tab w:val="left" w:pos="2748"/>
+          <w:tab w:val="left" w:pos="3664"/>
+          <w:tab w:val="left" w:pos="4580"/>
+          <w:tab w:val="left" w:pos="5496"/>
+          <w:tab w:val="left" w:pos="6412"/>
+          <w:tab w:val="left" w:pos="7328"/>
+          <w:tab w:val="left" w:pos="8244"/>
+          <w:tab w:val="left" w:pos="9160"/>
+          <w:tab w:val="left" w:pos="10076"/>
+          <w:tab w:val="left" w:pos="10992"/>
+          <w:tab w:val="left" w:pos="11908"/>
+          <w:tab w:val="left" w:pos="12824"/>
+          <w:tab w:val="left" w:pos="13740"/>
+          <w:tab w:val="left" w:pos="14656"/>
+        </w:tabs>
+        <w:spacing w:after="0" w:line="240" w:lineRule="auto"/>
+        <w:rPr>
+          <w:rFonts w:ascii="Courier New" w:eastAsia="Times New Roman" w:hAnsi="Courier New" w:cs="Courier New"/>
+          <w:sz w:val="20"/>
+          <w:szCs w:val="20"/>
+        </w:rPr>
+      </w:pPr>
+      <w:proofErr w:type="gramStart"/>
+      <w:r>
+        <w:rPr>
+          <w:rFonts w:ascii="Courier New" w:eastAsia="Times New Roman" w:hAnsi="Courier New" w:cs="Courier New"/>
+          <w:sz w:val="20"/>
+          <w:szCs w:val="20"/>
+        </w:rPr>
+        <w:t>short</w:t>
+      </w:r>
+      <w:proofErr w:type="gramEnd"/>
+      <w:r>
+        <w:rPr>
+          <w:rFonts w:ascii="Courier New" w:eastAsia="Times New Roman" w:hAnsi="Courier New" w:cs="Courier New"/>
+          <w:sz w:val="20"/>
+          <w:szCs w:val="20"/>
+        </w:rPr>
+        <w:t xml:space="preserve"> x = </w:t>
+      </w:r>
+      <w:proofErr w:type="spellStart"/>
+      <w:r>
+        <w:rPr>
+          <w:rFonts w:ascii="Courier New" w:eastAsia="Times New Roman" w:hAnsi="Courier New" w:cs="Courier New"/>
+          <w:sz w:val="20"/>
+          <w:szCs w:val="20"/>
+        </w:rPr>
+        <w:t>sc.nextShort</w:t>
+      </w:r>
+      <w:proofErr w:type="spellEnd"/>
+      <w:r>
+        <w:rPr>
+          <w:rFonts w:ascii="Courier New" w:eastAsia="Times New Roman" w:hAnsi="Courier New" w:cs="Courier New"/>
+          <w:sz w:val="20"/>
+          <w:szCs w:val="20"/>
+        </w:rPr>
+        <w:t>();</w:t>
+      </w:r>
+    </w:p>
+    <w:p>
+      <w:pPr>
+        <w:spacing w:before="100" w:beforeAutospacing="1" w:after="100" w:afterAutospacing="1" w:line="240" w:lineRule="auto"/>
+        <w:outlineLvl w:val="2"/>
+        <w:rPr>
+          <w:rFonts w:ascii="Times New Roman" w:eastAsia="Times New Roman" w:hAnsi="Times New Roman" w:cs="Times New Roman"/>
+          <w:b/>
+          <w:bCs/>
+          <w:color w:val="00B050"/>
+          <w:sz w:val="27"/>
+          <w:szCs w:val="27"/>
+        </w:rPr>
+      </w:pPr>
+      <w:r>
+        <w:rPr>
+          <w:rFonts w:ascii="Times New Roman" w:eastAsia="Times New Roman" w:hAnsi="Times New Roman" w:cs="Times New Roman"/>
+          <w:b/>
+          <w:bCs/>
+          <w:color w:val="00B050"/>
+          <w:sz w:val="27"/>
+          <w:szCs w:val="27"/>
+        </w:rPr>
+        <w:t>Q3. What are the three types of errors?</w:t>
+      </w:r>
+    </w:p>
+    <w:p>
+      <w:pPr>
+        <w:spacing w:before="100" w:beforeAutospacing="1" w:after="100" w:afterAutospacing="1" w:line="240" w:lineRule="auto"/>
+        <w:rPr>
+          <w:rFonts w:ascii="Times New Roman" w:eastAsia="Times New Roman" w:hAnsi="Times New Roman" w:cs="Times New Roman"/>
+          <w:color w:val="FF0000"/>
+          <w:sz w:val="24"/>
+          <w:szCs w:val="24"/>
+        </w:rPr>
+      </w:pPr>
+      <w:r>
+        <w:rPr>
+          <w:rFonts w:ascii="Times New Roman" w:eastAsia="Times New Roman" w:hAnsi="Times New Roman" w:cs="Times New Roman"/>
+          <w:b/>
+          <w:bCs/>
+          <w:color w:val="FF0000"/>
+          <w:sz w:val="24"/>
+          <w:szCs w:val="24"/>
+        </w:rPr>
+        <w:t>Answer:</w:t>
+      </w:r>
+    </w:p>
+    <w:p>
+      <w:pPr>
+        <w:numPr>
+          <w:ilvl w:val="0"/>
+          <w:numId w:val="2"/>
+        </w:numPr>
+        <w:spacing w:before="100" w:beforeAutospacing="1" w:after="100" w:afterAutospacing="1" w:line="240" w:lineRule="auto"/>
+        <w:rPr>
+          <w:rFonts w:ascii="Times New Roman" w:eastAsia="Times New Roman" w:hAnsi="Times New Roman" w:cs="Times New Roman"/>
+          <w:sz w:val="24"/>
+          <w:szCs w:val="24"/>
+        </w:rPr>
+      </w:pPr>
+      <w:r>
+        <w:rPr>
+          <w:rFonts w:ascii="Times New Roman" w:eastAsia="Times New Roman" w:hAnsi="Times New Roman" w:cs="Times New Roman"/>
+          <w:sz w:val="24"/>
+          <w:szCs w:val="24"/>
+        </w:rPr>
+        <w:t xml:space="preserve">Syntax error </w:t>
+      </w:r>
+    </w:p>
+    <w:p>
+      <w:pPr>
+        <w:numPr>
+          <w:ilvl w:val="0"/>
+          <w:numId w:val="2"/>
+        </w:numPr>
+        <w:spacing w:before="100" w:beforeAutospacing="1" w:after="100" w:afterAutospacing="1" w:line="240" w:lineRule="auto"/>
+        <w:rPr>
+          <w:rFonts w:ascii="Times New Roman" w:eastAsia="Times New Roman" w:hAnsi="Times New Roman" w:cs="Times New Roman"/>
+          <w:sz w:val="24"/>
+          <w:szCs w:val="24"/>
+        </w:rPr>
+      </w:pPr>
+      <w:r>
+        <w:rPr>
+          <w:rFonts w:ascii="Times New Roman" w:eastAsia="Times New Roman" w:hAnsi="Times New Roman" w:cs="Times New Roman"/>
+          <w:sz w:val="24"/>
+          <w:szCs w:val="24"/>
+        </w:rPr>
+        <w:t xml:space="preserve">Runtime error </w:t>
+      </w:r>
+    </w:p>
+    <w:p>
+      <w:pPr>
+        <w:numPr>
+          <w:ilvl w:val="0"/>
+          <w:numId w:val="2"/>
+        </w:numPr>
+        <w:spacing w:before="100" w:beforeAutospacing="1" w:after="100" w:afterAutospacing="1" w:line="240" w:lineRule="auto"/>
+        <w:rPr>
+          <w:rFonts w:ascii="Times New Roman" w:eastAsia="Times New Roman" w:hAnsi="Times New Roman" w:cs="Times New Roman"/>
+          <w:sz w:val="24"/>
+          <w:szCs w:val="24"/>
+        </w:rPr>
+      </w:pPr>
+      <w:r>
+        <w:rPr>
+          <w:rFonts w:ascii="Times New Roman" w:eastAsia="Times New Roman" w:hAnsi="Times New Roman" w:cs="Times New Roman"/>
+          <w:sz w:val="24"/>
+          <w:szCs w:val="24"/>
+        </w:rPr>
+        <w:t xml:space="preserve">Logical error </w:t>
+      </w:r>
+    </w:p>
+    <w:p>
+      <w:pPr>
+        <w:spacing w:before="100" w:beforeAutospacing="1" w:after="100" w:afterAutospacing="1" w:line="240" w:lineRule="auto"/>
+        <w:outlineLvl w:val="2"/>
+        <w:rPr>
+          <w:rFonts w:ascii="Times New Roman" w:eastAsia="Times New Roman" w:hAnsi="Times New Roman" w:cs="Times New Roman"/>
+          <w:b/>
+          <w:bCs/>
+          <w:color w:val="00B050"/>
+          <w:sz w:val="27"/>
+          <w:szCs w:val="27"/>
+        </w:rPr>
+      </w:pPr>
+      <w:r>
+        <w:rPr>
+          <w:rFonts w:ascii="Times New Roman" w:eastAsia="Times New Roman" w:hAnsi="Times New Roman" w:cs="Times New Roman"/>
+          <w:b/>
+          <w:bCs/>
+          <w:color w:val="00B050"/>
+          <w:sz w:val="27"/>
+          <w:szCs w:val="27"/>
+        </w:rPr>
+        <w:lastRenderedPageBreak/>
+        <w:t>Q4. Define error. Give an example.</w:t>
+      </w:r>
+    </w:p>
+    <w:p>
+      <w:pPr>
+        <w:spacing w:before="100" w:beforeAutospacing="1" w:after="100" w:afterAutospacing="1" w:line="240" w:lineRule="auto"/>
+        <w:rPr>
+          <w:rFonts w:ascii="Times New Roman" w:eastAsia="Times New Roman" w:hAnsi="Times New Roman" w:cs="Times New Roman"/>
+          <w:sz w:val="24"/>
+          <w:szCs w:val="24"/>
+        </w:rPr>
+      </w:pPr>
+      <w:r>
+        <w:rPr>
+          <w:rFonts w:ascii="Times New Roman" w:eastAsia="Times New Roman" w:hAnsi="Times New Roman" w:cs="Times New Roman"/>
+          <w:b/>
+          <w:bCs/>
+          <w:color w:val="FF0000"/>
+          <w:sz w:val="24"/>
+          <w:szCs w:val="24"/>
+        </w:rPr>
+        <w:t>Answer</w:t>
+      </w:r>
+      <w:proofErr w:type="gramStart"/>
+      <w:r>
+        <w:rPr>
+          <w:rFonts w:ascii="Times New Roman" w:eastAsia="Times New Roman" w:hAnsi="Times New Roman" w:cs="Times New Roman"/>
+          <w:b/>
+          <w:bCs/>
+          <w:color w:val="FF0000"/>
+          <w:sz w:val="24"/>
+          <w:szCs w:val="24"/>
+        </w:rPr>
+        <w:t>:</w:t>
+      </w:r>
+      <w:proofErr w:type="gramEnd"/>
+      <w:r>
+        <w:rPr>
+          <w:rFonts w:ascii="Times New Roman" w:eastAsia="Times New Roman" w:hAnsi="Times New Roman" w:cs="Times New Roman"/>
+          <w:color w:val="FF0000"/>
+          <w:sz w:val="24"/>
+          <w:szCs w:val="24"/>
+        </w:rPr>
+        <w:br/>
+      </w:r>
+      <w:r>
+        <w:rPr>
+          <w:rFonts w:ascii="Times New Roman" w:eastAsia="Times New Roman" w:hAnsi="Times New Roman" w:cs="Times New Roman"/>
+          <w:sz w:val="24"/>
+          <w:szCs w:val="24"/>
+        </w:rPr>
+        <w:t>An error is a mistake in a program that causes incorrect or abnormal execution.</w:t>
+      </w:r>
+    </w:p>
+    <w:p>
+      <w:pPr>
+        <w:spacing w:before="100" w:beforeAutospacing="1" w:after="100" w:afterAutospacing="1" w:line="240" w:lineRule="auto"/>
+        <w:rPr>
+          <w:rFonts w:ascii="Times New Roman" w:eastAsia="Times New Roman" w:hAnsi="Times New Roman" w:cs="Times New Roman"/>
+          <w:sz w:val="24"/>
+          <w:szCs w:val="24"/>
+        </w:rPr>
+      </w:pPr>
+      <w:r>
+        <w:rPr>
+          <w:rFonts w:ascii="Times New Roman" w:eastAsia="Times New Roman" w:hAnsi="Times New Roman" w:cs="Times New Roman"/>
+          <w:sz w:val="24"/>
+          <w:szCs w:val="24"/>
+        </w:rPr>
+        <w:t>Example: Missing semicolon → Syntax error</w:t>
+      </w:r>
+    </w:p>
+    <w:p>
+      <w:pPr>
+        <w:spacing w:before="100" w:beforeAutospacing="1" w:after="100" w:afterAutospacing="1" w:line="240" w:lineRule="auto"/>
+        <w:outlineLvl w:val="2"/>
+        <w:rPr>
+          <w:rFonts w:ascii="Times New Roman" w:eastAsia="Times New Roman" w:hAnsi="Times New Roman" w:cs="Times New Roman"/>
+          <w:b/>
+          <w:bCs/>
+          <w:color w:val="00B050"/>
+          <w:sz w:val="27"/>
+          <w:szCs w:val="27"/>
+        </w:rPr>
+      </w:pPr>
+      <w:r>
+        <w:rPr>
+          <w:rFonts w:ascii="Times New Roman" w:eastAsia="Times New Roman" w:hAnsi="Times New Roman" w:cs="Times New Roman"/>
+          <w:b/>
+          <w:bCs/>
+          <w:color w:val="00B050"/>
+          <w:sz w:val="27"/>
+          <w:szCs w:val="27"/>
+        </w:rPr>
+        <w:t xml:space="preserve">Q5. Write the difference between </w:t>
+      </w:r>
+      <w:proofErr w:type="gramStart"/>
+      <w:r>
+        <w:rPr>
+          <w:rFonts w:ascii="Times New Roman" w:eastAsia="Times New Roman" w:hAnsi="Times New Roman" w:cs="Times New Roman"/>
+          <w:b/>
+          <w:bCs/>
+          <w:color w:val="00B050"/>
+          <w:sz w:val="27"/>
+          <w:szCs w:val="27"/>
+        </w:rPr>
+        <w:t>next(</w:t>
+      </w:r>
+      <w:proofErr w:type="gramEnd"/>
+      <w:r>
+        <w:rPr>
+          <w:rFonts w:ascii="Times New Roman" w:eastAsia="Times New Roman" w:hAnsi="Times New Roman" w:cs="Times New Roman"/>
+          <w:b/>
+          <w:bCs/>
+          <w:color w:val="00B050"/>
+          <w:sz w:val="27"/>
+          <w:szCs w:val="27"/>
+        </w:rPr>
+        <w:t xml:space="preserve">) and </w:t>
+      </w:r>
+      <w:proofErr w:type="spellStart"/>
+      <w:r>
+        <w:rPr>
+          <w:rFonts w:ascii="Times New Roman" w:eastAsia="Times New Roman" w:hAnsi="Times New Roman" w:cs="Times New Roman"/>
+          <w:b/>
+          <w:bCs/>
+          <w:color w:val="00B050"/>
+          <w:sz w:val="27"/>
+          <w:szCs w:val="27"/>
+        </w:rPr>
+        <w:t>nextLine</w:t>
+      </w:r>
+      <w:proofErr w:type="spellEnd"/>
+      <w:r>
+        <w:rPr>
+          <w:rFonts w:ascii="Times New Roman" w:eastAsia="Times New Roman" w:hAnsi="Times New Roman" w:cs="Times New Roman"/>
+          <w:b/>
+          <w:bCs/>
+          <w:color w:val="00B050"/>
+          <w:sz w:val="27"/>
+          <w:szCs w:val="27"/>
+        </w:rPr>
+        <w:t>().</w:t>
+      </w:r>
+    </w:p>
+    <w:p>
+      <w:pPr>
+        <w:spacing w:before="100" w:beforeAutospacing="1" w:after="100" w:afterAutospacing="1" w:line="240" w:lineRule="auto"/>
+        <w:rPr>
+          <w:rFonts w:ascii="Times New Roman" w:eastAsia="Times New Roman" w:hAnsi="Times New Roman" w:cs="Times New Roman"/>
+          <w:color w:val="FF0000"/>
+          <w:sz w:val="24"/>
+          <w:szCs w:val="24"/>
+        </w:rPr>
+      </w:pPr>
+      <w:r>
+        <w:rPr>
+          <w:rFonts w:ascii="Times New Roman" w:eastAsia="Times New Roman" w:hAnsi="Times New Roman" w:cs="Times New Roman"/>
+          <w:b/>
+          <w:bCs/>
+          <w:color w:val="FF0000"/>
+          <w:sz w:val="24"/>
+          <w:szCs w:val="24"/>
+        </w:rPr>
+        <w:t>Answer:</w:t>
+      </w:r>
+    </w:p>
+    <w:p>
+      <w:pPr>
+        <w:numPr>
+          <w:ilvl w:val="0"/>
+          <w:numId w:val="3"/>
+        </w:numPr>
+        <w:spacing w:before="100" w:beforeAutospacing="1" w:after="100" w:afterAutospacing="1" w:line="240" w:lineRule="auto"/>
+        <w:rPr>
+          <w:rFonts w:ascii="Times New Roman" w:eastAsia="Times New Roman" w:hAnsi="Times New Roman" w:cs="Times New Roman"/>
+          <w:sz w:val="24"/>
+          <w:szCs w:val="24"/>
+        </w:rPr>
+      </w:pPr>
+      <w:r>
+        <w:rPr>
+          <w:rFonts w:ascii="Times New Roman" w:eastAsia="Times New Roman" w:hAnsi="Times New Roman" w:cs="Times New Roman"/>
+          <w:b/>
+          <w:bCs/>
+          <w:sz w:val="24"/>
+          <w:szCs w:val="24"/>
+        </w:rPr>
+        <w:t>next():</w:t>
+      </w:r>
+      <w:r>
+        <w:rPr>
+          <w:rFonts w:ascii="Times New Roman" w:eastAsia="Times New Roman" w:hAnsi="Times New Roman" w:cs="Times New Roman"/>
+          <w:sz w:val="24"/>
+          <w:szCs w:val="24"/>
+        </w:rPr>
+        <w:t xml:space="preserve"> Reads only one word </w:t>
+      </w:r>
+    </w:p>
+    <w:p>
+      <w:pPr>
+        <w:numPr>
+          <w:ilvl w:val="0"/>
+          <w:numId w:val="3"/>
+        </w:numPr>
+        <w:spacing w:before="100" w:beforeAutospacing="1" w:after="100" w:afterAutospacing="1" w:line="240" w:lineRule="auto"/>
+        <w:rPr>
+          <w:rFonts w:ascii="Times New Roman" w:eastAsia="Times New Roman" w:hAnsi="Times New Roman" w:cs="Times New Roman"/>
+          <w:sz w:val="24"/>
+          <w:szCs w:val="24"/>
+        </w:rPr>
+      </w:pPr>
+      <w:proofErr w:type="spellStart"/>
+      <w:r>
+        <w:rPr>
+          <w:rFonts w:ascii="Times New Roman" w:eastAsia="Times New Roman" w:hAnsi="Times New Roman" w:cs="Times New Roman"/>
+          <w:b/>
+          <w:bCs/>
+          <w:sz w:val="24"/>
+          <w:szCs w:val="24"/>
+        </w:rPr>
+        <w:t>nextLine</w:t>
+      </w:r>
+      <w:proofErr w:type="spellEnd"/>
+      <w:r>
+        <w:rPr>
+          <w:rFonts w:ascii="Times New Roman" w:eastAsia="Times New Roman" w:hAnsi="Times New Roman" w:cs="Times New Roman"/>
+          <w:b/>
+          <w:bCs/>
+          <w:sz w:val="24"/>
+          <w:szCs w:val="24"/>
+        </w:rPr>
+        <w:t>():</w:t>
+      </w:r>
+      <w:r>
+        <w:rPr>
+          <w:rFonts w:ascii="Times New Roman" w:eastAsia="Times New Roman" w:hAnsi="Times New Roman" w:cs="Times New Roman"/>
+          <w:sz w:val="24"/>
+          <w:szCs w:val="24"/>
+        </w:rPr>
+        <w:t xml:space="preserve"> Reads full line including spaces </w:t>
+      </w:r>
+    </w:p>
+    <w:p>
+      <w:pPr>
+        <w:spacing w:before="100" w:beforeAutospacing="1" w:after="100" w:afterAutospacing="1" w:line="240" w:lineRule="auto"/>
+        <w:outlineLvl w:val="0"/>
+        <w:rPr>
+          <w:rFonts w:ascii="Times New Roman" w:eastAsia="Times New Roman" w:hAnsi="Times New Roman" w:cs="Times New Roman"/>
+          <w:b/>
+          <w:bCs/>
+          <w:color w:val="00B0F0"/>
+          <w:kern w:val="36"/>
+          <w:sz w:val="48"/>
+          <w:szCs w:val="48"/>
+        </w:rPr>
+      </w:pPr>
+      <w:r>
+        <w:rPr>
+          <w:rFonts w:ascii="Times New Roman" w:eastAsia="Times New Roman" w:hAnsi="Times New Roman" w:cs="Times New Roman"/>
+          <w:b/>
+          <w:bCs/>
+          <w:color w:val="00B0F0"/>
+          <w:kern w:val="36"/>
+          <w:sz w:val="48"/>
+          <w:szCs w:val="48"/>
+        </w:rPr>
+        <w:t>D. Assertion and Reasoning based questions</w:t>
+      </w:r>
+    </w:p>
+    <w:p>
+      <w:pPr>
+        <w:spacing w:before="100" w:beforeAutospacing="1" w:after="100" w:afterAutospacing="1" w:line="240" w:lineRule="auto"/>
+        <w:outlineLvl w:val="2"/>
+        <w:rPr>
+          <w:rFonts w:ascii="Times New Roman" w:eastAsia="Times New Roman" w:hAnsi="Times New Roman" w:cs="Times New Roman"/>
+          <w:b/>
+          <w:bCs/>
+          <w:color w:val="00B050"/>
+          <w:sz w:val="27"/>
+          <w:szCs w:val="27"/>
+        </w:rPr>
+      </w:pPr>
+      <w:r>
+        <w:rPr>
+          <w:rFonts w:ascii="Times New Roman" w:eastAsia="Times New Roman" w:hAnsi="Times New Roman" w:cs="Times New Roman"/>
+          <w:b/>
+          <w:bCs/>
+          <w:color w:val="00B050"/>
+          <w:sz w:val="27"/>
+          <w:szCs w:val="27"/>
+        </w:rPr>
+        <w:t>Q1.</w:t>
+      </w:r>
+    </w:p>
+    <w:p>
+      <w:pPr>
+        <w:spacing w:before="100" w:beforeAutospacing="1" w:after="100" w:afterAutospacing="1" w:line="240" w:lineRule="auto"/>
+        <w:rPr>
+          <w:rFonts w:ascii="Times New Roman" w:eastAsia="Times New Roman" w:hAnsi="Times New Roman" w:cs="Times New Roman"/>
+          <w:sz w:val="24"/>
+          <w:szCs w:val="24"/>
+        </w:rPr>
+      </w:pPr>
+      <w:r>
+        <w:rPr>
+          <w:rFonts w:ascii="Times New Roman" w:eastAsia="Times New Roman" w:hAnsi="Times New Roman" w:cs="Times New Roman"/>
+          <w:sz w:val="24"/>
+          <w:szCs w:val="24"/>
+        </w:rPr>
+        <w:t>Assertion: Comments in Java are compiled into bytecode</w:t>
+      </w:r>
+      <w:r>
+        <w:rPr>
+          <w:rFonts w:ascii="Times New Roman" w:eastAsia="Times New Roman" w:hAnsi="Times New Roman" w:cs="Times New Roman"/>
+          <w:sz w:val="24"/>
+          <w:szCs w:val="24"/>
+        </w:rPr>
+        <w:br/>
+        <w:t>Reason: Comments are included for explanation</w:t>
+      </w:r>
+    </w:p>
+    <w:p>
+      <w:pPr>
+        <w:spacing w:before="100" w:beforeAutospacing="1" w:after="100" w:afterAutospacing="1" w:line="240" w:lineRule="auto"/>
+        <w:rPr>
+          <w:rFonts w:ascii="Times New Roman" w:eastAsia="Times New Roman" w:hAnsi="Times New Roman" w:cs="Times New Roman"/>
+          <w:color w:val="FF0000"/>
+          <w:sz w:val="24"/>
+          <w:szCs w:val="24"/>
+        </w:rPr>
+      </w:pPr>
+      <w:r>
+        <w:rPr>
+          <w:rFonts w:ascii="Times New Roman" w:eastAsia="Times New Roman" w:hAnsi="Times New Roman" w:cs="Times New Roman"/>
+          <w:b/>
+          <w:bCs/>
+          <w:color w:val="FF0000"/>
+          <w:sz w:val="24"/>
+          <w:szCs w:val="24"/>
+        </w:rPr>
+        <w:t>Answer:</w:t>
+      </w:r>
+      <w:r>
+        <w:rPr>
+          <w:rFonts w:ascii="Times New Roman" w:eastAsia="Times New Roman" w:hAnsi="Times New Roman" w:cs="Times New Roman"/>
+          <w:color w:val="FF0000"/>
+          <w:sz w:val="24"/>
+          <w:szCs w:val="24"/>
+        </w:rPr>
+        <w:t xml:space="preserve"> c. A is false, but R is true</w:t>
+      </w:r>
+    </w:p>
+    <w:p>
+      <w:pPr>
+        <w:spacing w:before="100" w:beforeAutospacing="1" w:after="100" w:afterAutospacing="1" w:line="240" w:lineRule="auto"/>
+        <w:outlineLvl w:val="2"/>
+        <w:rPr>
+          <w:rFonts w:ascii="Times New Roman" w:eastAsia="Times New Roman" w:hAnsi="Times New Roman" w:cs="Times New Roman"/>
+          <w:b/>
+          <w:bCs/>
+          <w:color w:val="00B050"/>
+          <w:sz w:val="27"/>
+          <w:szCs w:val="27"/>
+        </w:rPr>
+      </w:pPr>
+      <w:r>
+        <w:rPr>
+          <w:rFonts w:ascii="Times New Roman" w:eastAsia="Times New Roman" w:hAnsi="Times New Roman" w:cs="Times New Roman"/>
+          <w:b/>
+          <w:bCs/>
+          <w:color w:val="00B050"/>
+          <w:sz w:val="27"/>
+          <w:szCs w:val="27"/>
+        </w:rPr>
+        <w:t>Q2.</w:t>
+      </w:r>
+    </w:p>
+    <w:p>
+      <w:pPr>
+        <w:spacing w:before="100" w:beforeAutospacing="1" w:after="100" w:afterAutospacing="1" w:line="240" w:lineRule="auto"/>
+        <w:rPr>
+          <w:rFonts w:ascii="Times New Roman" w:eastAsia="Times New Roman" w:hAnsi="Times New Roman" w:cs="Times New Roman"/>
+          <w:sz w:val="24"/>
+          <w:szCs w:val="24"/>
+        </w:rPr>
+      </w:pPr>
+      <w:r>
+        <w:rPr>
+          <w:rFonts w:ascii="Times New Roman" w:eastAsia="Times New Roman" w:hAnsi="Times New Roman" w:cs="Times New Roman"/>
+          <w:sz w:val="24"/>
+          <w:szCs w:val="24"/>
+        </w:rPr>
+        <w:t xml:space="preserve">Assertion: </w:t>
+      </w:r>
+      <w:proofErr w:type="spellStart"/>
+      <w:r>
+        <w:rPr>
+          <w:rFonts w:ascii="Times New Roman" w:eastAsia="Times New Roman" w:hAnsi="Times New Roman" w:cs="Times New Roman"/>
+          <w:sz w:val="24"/>
+          <w:szCs w:val="24"/>
+        </w:rPr>
+        <w:t>java.lang</w:t>
+      </w:r>
+      <w:proofErr w:type="spellEnd"/>
+      <w:r>
+        <w:rPr>
+          <w:rFonts w:ascii="Times New Roman" w:eastAsia="Times New Roman" w:hAnsi="Times New Roman" w:cs="Times New Roman"/>
+          <w:sz w:val="24"/>
+          <w:szCs w:val="24"/>
+        </w:rPr>
+        <w:t xml:space="preserve"> package is automatically imported</w:t>
+      </w:r>
+      <w:r>
+        <w:rPr>
+          <w:rFonts w:ascii="Times New Roman" w:eastAsia="Times New Roman" w:hAnsi="Times New Roman" w:cs="Times New Roman"/>
+          <w:sz w:val="24"/>
+          <w:szCs w:val="24"/>
+        </w:rPr>
+        <w:br/>
+        <w:t>Reason: It contains fundamental classes</w:t>
+      </w:r>
+    </w:p>
+    <w:p>
+      <w:pPr>
+        <w:spacing w:before="100" w:beforeAutospacing="1" w:after="100" w:afterAutospacing="1" w:line="240" w:lineRule="auto"/>
+        <w:rPr>
+          <w:rFonts w:ascii="Times New Roman" w:eastAsia="Times New Roman" w:hAnsi="Times New Roman" w:cs="Times New Roman"/>
+          <w:color w:val="FF0000"/>
+          <w:sz w:val="24"/>
+          <w:szCs w:val="24"/>
+        </w:rPr>
+      </w:pPr>
+      <w:r>
+        <w:rPr>
+          <w:rFonts w:ascii="Times New Roman" w:eastAsia="Times New Roman" w:hAnsi="Times New Roman" w:cs="Times New Roman"/>
+          <w:b/>
+          <w:bCs/>
+          <w:color w:val="FF0000"/>
+          <w:sz w:val="24"/>
+          <w:szCs w:val="24"/>
+        </w:rPr>
+        <w:t>Answer:</w:t>
+      </w:r>
+      <w:r>
+        <w:rPr>
+          <w:rFonts w:ascii="Times New Roman" w:eastAsia="Times New Roman" w:hAnsi="Times New Roman" w:cs="Times New Roman"/>
+          <w:color w:val="FF0000"/>
+          <w:sz w:val="24"/>
+          <w:szCs w:val="24"/>
+        </w:rPr>
+        <w:t xml:space="preserve"> a. </w:t>
+      </w:r>
+      <w:proofErr w:type="gramStart"/>
+      <w:r>
+        <w:rPr>
+          <w:rFonts w:ascii="Times New Roman" w:eastAsia="Times New Roman" w:hAnsi="Times New Roman" w:cs="Times New Roman"/>
+          <w:color w:val="FF0000"/>
+          <w:sz w:val="24"/>
+          <w:szCs w:val="24"/>
+        </w:rPr>
+        <w:t>Both</w:t>
+      </w:r>
+      <w:proofErr w:type="gramEnd"/>
+      <w:r>
+        <w:rPr>
+          <w:rFonts w:ascii="Times New Roman" w:eastAsia="Times New Roman" w:hAnsi="Times New Roman" w:cs="Times New Roman"/>
+          <w:color w:val="FF0000"/>
+          <w:sz w:val="24"/>
+          <w:szCs w:val="24"/>
+        </w:rPr>
+        <w:t xml:space="preserve"> true and correct</w:t>
+      </w:r>
+    </w:p>
+    <w:p>
+      <w:pPr>
+        <w:spacing w:before="100" w:beforeAutospacing="1" w:after="100" w:afterAutospacing="1" w:line="240" w:lineRule="auto"/>
+        <w:outlineLvl w:val="2"/>
+        <w:rPr>
+          <w:rFonts w:ascii="Times New Roman" w:eastAsia="Times New Roman" w:hAnsi="Times New Roman" w:cs="Times New Roman"/>
+          <w:b/>
+          <w:bCs/>
+          <w:color w:val="00B050"/>
+          <w:sz w:val="27"/>
+          <w:szCs w:val="27"/>
+        </w:rPr>
+      </w:pPr>
+      <w:r>
+        <w:rPr>
+          <w:rFonts w:ascii="Times New Roman" w:eastAsia="Times New Roman" w:hAnsi="Times New Roman" w:cs="Times New Roman"/>
+          <w:b/>
+          <w:bCs/>
+          <w:color w:val="00B050"/>
+          <w:sz w:val="27"/>
+          <w:szCs w:val="27"/>
+        </w:rPr>
+        <w:t>Q3.</w:t>
+      </w:r>
+    </w:p>
+    <w:p>
+      <w:pPr>
+        <w:spacing w:before="100" w:beforeAutospacing="1" w:after="100" w:afterAutospacing="1" w:line="240" w:lineRule="auto"/>
+        <w:rPr>
+          <w:rFonts w:ascii="Times New Roman" w:eastAsia="Times New Roman" w:hAnsi="Times New Roman" w:cs="Times New Roman"/>
+          <w:sz w:val="24"/>
+          <w:szCs w:val="24"/>
+        </w:rPr>
+      </w:pPr>
+      <w:r>
+        <w:rPr>
+          <w:rFonts w:ascii="Times New Roman" w:eastAsia="Times New Roman" w:hAnsi="Times New Roman" w:cs="Times New Roman"/>
+          <w:sz w:val="24"/>
+          <w:szCs w:val="24"/>
+        </w:rPr>
+        <w:t xml:space="preserve">Assertion: Scanner class is in </w:t>
+      </w:r>
+      <w:proofErr w:type="spellStart"/>
+      <w:r>
+        <w:rPr>
+          <w:rFonts w:ascii="Times New Roman" w:eastAsia="Times New Roman" w:hAnsi="Times New Roman" w:cs="Times New Roman"/>
+          <w:sz w:val="24"/>
+          <w:szCs w:val="24"/>
+        </w:rPr>
+        <w:t>java.util</w:t>
+      </w:r>
+      <w:proofErr w:type="spellEnd"/>
+      <w:r>
+        <w:rPr>
+          <w:rFonts w:ascii="Times New Roman" w:eastAsia="Times New Roman" w:hAnsi="Times New Roman" w:cs="Times New Roman"/>
+          <w:sz w:val="24"/>
+          <w:szCs w:val="24"/>
+        </w:rPr>
+        <w:t xml:space="preserve"> package</w:t>
+      </w:r>
+      <w:r>
+        <w:rPr>
+          <w:rFonts w:ascii="Times New Roman" w:eastAsia="Times New Roman" w:hAnsi="Times New Roman" w:cs="Times New Roman"/>
+          <w:sz w:val="24"/>
+          <w:szCs w:val="24"/>
+        </w:rPr>
+        <w:br/>
+        <w:t>Reason: It must be imported</w:t>
+      </w:r>
+    </w:p>
+    <w:p>
+      <w:pPr>
+        <w:spacing w:before="100" w:beforeAutospacing="1" w:after="100" w:afterAutospacing="1" w:line="240" w:lineRule="auto"/>
+        <w:rPr>
+          <w:rFonts w:ascii="Times New Roman" w:eastAsia="Times New Roman" w:hAnsi="Times New Roman" w:cs="Times New Roman"/>
+          <w:color w:val="FF0000"/>
+          <w:sz w:val="24"/>
+          <w:szCs w:val="24"/>
+        </w:rPr>
+      </w:pPr>
+      <w:r>
+        <w:rPr>
+          <w:rFonts w:ascii="Times New Roman" w:eastAsia="Times New Roman" w:hAnsi="Times New Roman" w:cs="Times New Roman"/>
+          <w:b/>
+          <w:bCs/>
+          <w:color w:val="FF0000"/>
+          <w:sz w:val="24"/>
+          <w:szCs w:val="24"/>
+        </w:rPr>
+        <w:t>Answer:</w:t>
+      </w:r>
+      <w:r>
+        <w:rPr>
+          <w:rFonts w:ascii="Times New Roman" w:eastAsia="Times New Roman" w:hAnsi="Times New Roman" w:cs="Times New Roman"/>
+          <w:color w:val="FF0000"/>
+          <w:sz w:val="24"/>
+          <w:szCs w:val="24"/>
+        </w:rPr>
+        <w:t xml:space="preserve"> a. </w:t>
+      </w:r>
+      <w:proofErr w:type="gramStart"/>
+      <w:r>
+        <w:rPr>
+          <w:rFonts w:ascii="Times New Roman" w:eastAsia="Times New Roman" w:hAnsi="Times New Roman" w:cs="Times New Roman"/>
+          <w:color w:val="FF0000"/>
+          <w:sz w:val="24"/>
+          <w:szCs w:val="24"/>
+        </w:rPr>
+        <w:t>Both</w:t>
+      </w:r>
+      <w:proofErr w:type="gramEnd"/>
+      <w:r>
+        <w:rPr>
+          <w:rFonts w:ascii="Times New Roman" w:eastAsia="Times New Roman" w:hAnsi="Times New Roman" w:cs="Times New Roman"/>
+          <w:color w:val="FF0000"/>
+          <w:sz w:val="24"/>
+          <w:szCs w:val="24"/>
+        </w:rPr>
+        <w:t xml:space="preserve"> true and correct</w:t>
+      </w:r>
+    </w:p>
+    <w:p>
+      <w:pPr>
+        <w:spacing w:before="100" w:beforeAutospacing="1" w:after="100" w:afterAutospacing="1" w:line="240" w:lineRule="auto"/>
+        <w:outlineLvl w:val="2"/>
+        <w:rPr>
+          <w:rFonts w:ascii="Times New Roman" w:eastAsia="Times New Roman" w:hAnsi="Times New Roman" w:cs="Times New Roman"/>
+          <w:b/>
+          <w:bCs/>
+          <w:color w:val="00B050"/>
+          <w:sz w:val="27"/>
+          <w:szCs w:val="27"/>
+        </w:rPr>
+      </w:pPr>
+      <w:r>
+        <w:rPr>
+          <w:rFonts w:ascii="Times New Roman" w:eastAsia="Times New Roman" w:hAnsi="Times New Roman" w:cs="Times New Roman"/>
+          <w:b/>
+          <w:bCs/>
+          <w:color w:val="00B050"/>
+          <w:sz w:val="27"/>
+          <w:szCs w:val="27"/>
+        </w:rPr>
+        <w:t>Q4.</w:t>
+      </w:r>
+    </w:p>
+    <w:p>
+      <w:pPr>
+        <w:spacing w:before="100" w:beforeAutospacing="1" w:after="100" w:afterAutospacing="1" w:line="240" w:lineRule="auto"/>
+        <w:rPr>
+          <w:rFonts w:ascii="Times New Roman" w:eastAsia="Times New Roman" w:hAnsi="Times New Roman" w:cs="Times New Roman"/>
+          <w:sz w:val="24"/>
+          <w:szCs w:val="24"/>
+        </w:rPr>
+      </w:pPr>
+      <w:r>
+        <w:rPr>
+          <w:rFonts w:ascii="Times New Roman" w:eastAsia="Times New Roman" w:hAnsi="Times New Roman" w:cs="Times New Roman"/>
+          <w:sz w:val="24"/>
+          <w:szCs w:val="24"/>
+        </w:rPr>
+        <w:t>Assertion: Comments do not affect execution</w:t>
+      </w:r>
+      <w:r>
+        <w:rPr>
+          <w:rFonts w:ascii="Times New Roman" w:eastAsia="Times New Roman" w:hAnsi="Times New Roman" w:cs="Times New Roman"/>
+          <w:sz w:val="24"/>
+          <w:szCs w:val="24"/>
+        </w:rPr>
+        <w:br/>
+        <w:t>Reason: Comments are ignored by compiler</w:t>
+      </w:r>
+    </w:p>
+    <w:p>
+      <w:pPr>
+        <w:spacing w:before="100" w:beforeAutospacing="1" w:after="100" w:afterAutospacing="1" w:line="240" w:lineRule="auto"/>
+        <w:rPr>
+          <w:rFonts w:ascii="Times New Roman" w:eastAsia="Times New Roman" w:hAnsi="Times New Roman" w:cs="Times New Roman"/>
+          <w:color w:val="FF0000"/>
+          <w:sz w:val="24"/>
+          <w:szCs w:val="24"/>
+        </w:rPr>
+      </w:pPr>
+      <w:r>
+        <w:rPr>
+          <w:rFonts w:ascii="Times New Roman" w:eastAsia="Times New Roman" w:hAnsi="Times New Roman" w:cs="Times New Roman"/>
+          <w:b/>
+          <w:bCs/>
+          <w:color w:val="FF0000"/>
+          <w:sz w:val="24"/>
+          <w:szCs w:val="24"/>
+        </w:rPr>
+        <w:t>Answer:</w:t>
+      </w:r>
+      <w:r>
+        <w:rPr>
+          <w:rFonts w:ascii="Times New Roman" w:eastAsia="Times New Roman" w:hAnsi="Times New Roman" w:cs="Times New Roman"/>
+          <w:color w:val="FF0000"/>
+          <w:sz w:val="24"/>
+          <w:szCs w:val="24"/>
+        </w:rPr>
+        <w:t xml:space="preserve"> a. </w:t>
+      </w:r>
+      <w:proofErr w:type="gramStart"/>
+      <w:r>
+        <w:rPr>
+          <w:rFonts w:ascii="Times New Roman" w:eastAsia="Times New Roman" w:hAnsi="Times New Roman" w:cs="Times New Roman"/>
+          <w:color w:val="FF0000"/>
+          <w:sz w:val="24"/>
+          <w:szCs w:val="24"/>
+        </w:rPr>
+        <w:t>Both</w:t>
+      </w:r>
+      <w:proofErr w:type="gramEnd"/>
+      <w:r>
+        <w:rPr>
+          <w:rFonts w:ascii="Times New Roman" w:eastAsia="Times New Roman" w:hAnsi="Times New Roman" w:cs="Times New Roman"/>
+          <w:color w:val="FF0000"/>
+          <w:sz w:val="24"/>
+          <w:szCs w:val="24"/>
+        </w:rPr>
+        <w:t xml:space="preserve"> true and correct</w:t>
+      </w:r>
+    </w:p>
+    <w:p>
+      <w:pPr>
+        <w:spacing w:before="100" w:beforeAutospacing="1" w:after="100" w:afterAutospacing="1" w:line="240" w:lineRule="auto"/>
+        <w:outlineLvl w:val="0"/>
+        <w:rPr>
+          <w:rFonts w:ascii="Times New Roman" w:eastAsia="Times New Roman" w:hAnsi="Times New Roman" w:cs="Times New Roman"/>
+          <w:b/>
+          <w:bCs/>
+          <w:color w:val="00B0F0"/>
+          <w:kern w:val="36"/>
+          <w:sz w:val="48"/>
+          <w:szCs w:val="48"/>
+        </w:rPr>
+      </w:pPr>
+      <w:r>
+        <w:rPr>
+          <w:rFonts w:ascii="Times New Roman" w:eastAsia="Times New Roman" w:hAnsi="Times New Roman" w:cs="Times New Roman"/>
+          <w:b/>
+          <w:bCs/>
+          <w:color w:val="00B0F0"/>
+          <w:kern w:val="36"/>
+          <w:sz w:val="48"/>
+          <w:szCs w:val="48"/>
+        </w:rPr>
+        <w:t>E. Case-based questions</w:t>
+      </w:r>
+    </w:p>
+    <w:p>
+      <w:pPr>
+        <w:spacing w:before="100" w:beforeAutospacing="1" w:after="100" w:afterAutospacing="1" w:line="240" w:lineRule="auto"/>
+        <w:outlineLvl w:val="2"/>
+        <w:rPr>
+          <w:rFonts w:ascii="Times New Roman" w:eastAsia="Times New Roman" w:hAnsi="Times New Roman" w:cs="Times New Roman"/>
+          <w:b/>
+          <w:bCs/>
+          <w:color w:val="00B050"/>
+          <w:sz w:val="27"/>
+          <w:szCs w:val="27"/>
+        </w:rPr>
+      </w:pPr>
+      <w:r>
+        <w:rPr>
+          <w:rFonts w:ascii="Times New Roman" w:eastAsia="Times New Roman" w:hAnsi="Times New Roman" w:cs="Times New Roman"/>
+          <w:b/>
+          <w:bCs/>
+          <w:color w:val="00B050"/>
+          <w:sz w:val="27"/>
+          <w:szCs w:val="27"/>
+        </w:rPr>
+        <w:t>Q1. What type of comment is Jake using and what is its purpose?</w:t>
+      </w:r>
+    </w:p>
+    <w:p>
+      <w:pPr>
+        <w:spacing w:before="100" w:beforeAutospacing="1" w:after="100" w:afterAutospacing="1" w:line="240" w:lineRule="auto"/>
+        <w:rPr>
+          <w:rFonts w:ascii="Times New Roman" w:eastAsia="Times New Roman" w:hAnsi="Times New Roman" w:cs="Times New Roman"/>
+          <w:sz w:val="24"/>
+          <w:szCs w:val="24"/>
+        </w:rPr>
+      </w:pPr>
+      <w:r>
+        <w:rPr>
+          <w:rFonts w:ascii="Times New Roman" w:eastAsia="Times New Roman" w:hAnsi="Times New Roman" w:cs="Times New Roman"/>
+          <w:sz w:val="24"/>
+          <w:szCs w:val="24"/>
+        </w:rPr>
+        <w:lastRenderedPageBreak/>
+        <w:t>a. Single-line</w:t>
+      </w:r>
+      <w:r>
+        <w:rPr>
+          <w:rFonts w:ascii="Times New Roman" w:eastAsia="Times New Roman" w:hAnsi="Times New Roman" w:cs="Times New Roman"/>
+          <w:sz w:val="24"/>
+          <w:szCs w:val="24"/>
+        </w:rPr>
+        <w:br/>
+        <w:t>b. Multi-line</w:t>
+      </w:r>
+      <w:r>
+        <w:rPr>
+          <w:rFonts w:ascii="Times New Roman" w:eastAsia="Times New Roman" w:hAnsi="Times New Roman" w:cs="Times New Roman"/>
+          <w:sz w:val="24"/>
+          <w:szCs w:val="24"/>
+        </w:rPr>
+        <w:br/>
+        <w:t>c. Javadoc</w:t>
+      </w:r>
+      <w:r>
+        <w:rPr>
+          <w:rFonts w:ascii="Times New Roman" w:eastAsia="Times New Roman" w:hAnsi="Times New Roman" w:cs="Times New Roman"/>
+          <w:sz w:val="24"/>
+          <w:szCs w:val="24"/>
+        </w:rPr>
+        <w:br/>
+        <w:t>d. Inline</w:t>
+      </w:r>
+    </w:p>
+    <w:p>
+      <w:pPr>
+        <w:spacing w:before="100" w:beforeAutospacing="1" w:after="100" w:afterAutospacing="1" w:line="240" w:lineRule="auto"/>
+        <w:rPr>
+          <w:rFonts w:ascii="Times New Roman" w:eastAsia="Times New Roman" w:hAnsi="Times New Roman" w:cs="Times New Roman"/>
+          <w:color w:val="FF0000"/>
+          <w:sz w:val="24"/>
+          <w:szCs w:val="24"/>
+        </w:rPr>
+      </w:pPr>
+      <w:r>
+        <w:rPr>
+          <w:rFonts w:ascii="Times New Roman" w:eastAsia="Times New Roman" w:hAnsi="Times New Roman" w:cs="Times New Roman"/>
+          <w:b/>
+          <w:bCs/>
+          <w:color w:val="FF0000"/>
+          <w:sz w:val="24"/>
+          <w:szCs w:val="24"/>
+        </w:rPr>
+        <w:t>Answer:</w:t>
+      </w:r>
+      <w:r>
+        <w:rPr>
+          <w:rFonts w:ascii="Times New Roman" w:eastAsia="Times New Roman" w:hAnsi="Times New Roman" w:cs="Times New Roman"/>
+          <w:color w:val="FF0000"/>
+          <w:sz w:val="24"/>
+          <w:szCs w:val="24"/>
+        </w:rPr>
+        <w:t xml:space="preserve"> c. Javadoc comment</w:t>
+      </w:r>
+    </w:p>
+    <w:p>
+      <w:pPr>
+        <w:spacing w:before="100" w:beforeAutospacing="1" w:after="100" w:afterAutospacing="1" w:line="240" w:lineRule="auto"/>
+        <w:outlineLvl w:val="2"/>
+        <w:rPr>
+          <w:rFonts w:ascii="Times New Roman" w:eastAsia="Times New Roman" w:hAnsi="Times New Roman" w:cs="Times New Roman"/>
+          <w:b/>
+          <w:bCs/>
+          <w:color w:val="00B050"/>
+          <w:sz w:val="27"/>
+          <w:szCs w:val="27"/>
+        </w:rPr>
+      </w:pPr>
+      <w:r>
+        <w:rPr>
+          <w:rFonts w:ascii="Times New Roman" w:eastAsia="Times New Roman" w:hAnsi="Times New Roman" w:cs="Times New Roman"/>
+          <w:b/>
+          <w:bCs/>
+          <w:color w:val="00B050"/>
+          <w:sz w:val="27"/>
+          <w:szCs w:val="27"/>
+        </w:rPr>
+        <w:t xml:space="preserve">Q2. What is the purpose of initializing </w:t>
+      </w:r>
+      <w:proofErr w:type="spellStart"/>
+      <w:r>
+        <w:rPr>
+          <w:rFonts w:ascii="Times New Roman" w:eastAsia="Times New Roman" w:hAnsi="Times New Roman" w:cs="Times New Roman"/>
+          <w:b/>
+          <w:bCs/>
+          <w:color w:val="00B050"/>
+          <w:sz w:val="27"/>
+          <w:szCs w:val="27"/>
+        </w:rPr>
+        <w:t>totalPrice</w:t>
+      </w:r>
+      <w:proofErr w:type="spellEnd"/>
+      <w:r>
+        <w:rPr>
+          <w:rFonts w:ascii="Times New Roman" w:eastAsia="Times New Roman" w:hAnsi="Times New Roman" w:cs="Times New Roman"/>
+          <w:b/>
+          <w:bCs/>
+          <w:color w:val="00B050"/>
+          <w:sz w:val="27"/>
+          <w:szCs w:val="27"/>
+        </w:rPr>
+        <w:t xml:space="preserve"> to 0.0?</w:t>
+      </w:r>
+    </w:p>
+    <w:p>
+      <w:pPr>
+        <w:spacing w:before="100" w:beforeAutospacing="1" w:after="100" w:afterAutospacing="1" w:line="240" w:lineRule="auto"/>
+        <w:rPr>
+          <w:rFonts w:ascii="Times New Roman" w:eastAsia="Times New Roman" w:hAnsi="Times New Roman" w:cs="Times New Roman"/>
+          <w:sz w:val="24"/>
+          <w:szCs w:val="24"/>
+        </w:rPr>
+      </w:pPr>
+      <w:r>
+        <w:rPr>
+          <w:rFonts w:ascii="Times New Roman" w:eastAsia="Times New Roman" w:hAnsi="Times New Roman" w:cs="Times New Roman"/>
+          <w:sz w:val="24"/>
+          <w:szCs w:val="24"/>
+        </w:rPr>
+        <w:t>a. Avoid compilation error</w:t>
+      </w:r>
+      <w:r>
+        <w:rPr>
+          <w:rFonts w:ascii="Times New Roman" w:eastAsia="Times New Roman" w:hAnsi="Times New Roman" w:cs="Times New Roman"/>
+          <w:sz w:val="24"/>
+          <w:szCs w:val="24"/>
+        </w:rPr>
+        <w:br/>
+        <w:t>b. Set starting value</w:t>
+      </w:r>
+      <w:r>
+        <w:rPr>
+          <w:rFonts w:ascii="Times New Roman" w:eastAsia="Times New Roman" w:hAnsi="Times New Roman" w:cs="Times New Roman"/>
+          <w:sz w:val="24"/>
+          <w:szCs w:val="24"/>
+        </w:rPr>
+        <w:br/>
+        <w:t>c. Reserve memory</w:t>
+      </w:r>
+      <w:r>
+        <w:rPr>
+          <w:rFonts w:ascii="Times New Roman" w:eastAsia="Times New Roman" w:hAnsi="Times New Roman" w:cs="Times New Roman"/>
+          <w:sz w:val="24"/>
+          <w:szCs w:val="24"/>
+        </w:rPr>
+        <w:br/>
+        <w:t>d. Improve readability</w:t>
+      </w:r>
+    </w:p>
+    <w:p>
+      <w:pPr>
+        <w:spacing w:before="100" w:beforeAutospacing="1" w:after="100" w:afterAutospacing="1" w:line="240" w:lineRule="auto"/>
+        <w:rPr>
+          <w:rFonts w:ascii="Times New Roman" w:eastAsia="Times New Roman" w:hAnsi="Times New Roman" w:cs="Times New Roman"/>
+          <w:color w:val="FF0000"/>
+          <w:sz w:val="24"/>
+          <w:szCs w:val="24"/>
+        </w:rPr>
+      </w:pPr>
+      <w:r>
+        <w:rPr>
+          <w:rFonts w:ascii="Times New Roman" w:eastAsia="Times New Roman" w:hAnsi="Times New Roman" w:cs="Times New Roman"/>
+          <w:b/>
+          <w:bCs/>
+          <w:color w:val="FF0000"/>
+          <w:sz w:val="24"/>
+          <w:szCs w:val="24"/>
+        </w:rPr>
+        <w:t>Answer:</w:t>
+      </w:r>
+      <w:r>
+        <w:rPr>
+          <w:rFonts w:ascii="Times New Roman" w:eastAsia="Times New Roman" w:hAnsi="Times New Roman" w:cs="Times New Roman"/>
+          <w:color w:val="FF0000"/>
+          <w:sz w:val="24"/>
+          <w:szCs w:val="24"/>
+        </w:rPr>
+        <w:t xml:space="preserve"> b. </w:t>
+      </w:r>
+      <w:proofErr w:type="gramStart"/>
+      <w:r>
+        <w:rPr>
+          <w:rFonts w:ascii="Times New Roman" w:eastAsia="Times New Roman" w:hAnsi="Times New Roman" w:cs="Times New Roman"/>
+          <w:color w:val="FF0000"/>
+          <w:sz w:val="24"/>
+          <w:szCs w:val="24"/>
+        </w:rPr>
+        <w:t>To</w:t>
+      </w:r>
+      <w:proofErr w:type="gramEnd"/>
+      <w:r>
+        <w:rPr>
+          <w:rFonts w:ascii="Times New Roman" w:eastAsia="Times New Roman" w:hAnsi="Times New Roman" w:cs="Times New Roman"/>
+          <w:color w:val="FF0000"/>
+          <w:sz w:val="24"/>
+          <w:szCs w:val="24"/>
+        </w:rPr>
+        <w:t xml:space="preserve"> set a starting value</w:t>
+      </w:r>
+    </w:p>
+    <w:p>
+      <w:pPr>
         <w:ind w:left="90"/>
-      </w:pPr>
+        <w:jc w:val="center"/>
+        <w:rPr>
+          <w:sz w:val="36"/>
+        </w:rPr>
+      </w:pPr>
+      <w:r>
+        <w:rPr>
+          <w:sz w:val="36"/>
+        </w:rPr>
+        <w:t>****************************</w:t>
+      </w:r>
+      <w:bookmarkStart w:id="0" w:name="_GoBack"/>
+      <w:bookmarkEnd w:id="0"/>
+      <w:r>
+        <w:rPr>
+          <w:sz w:val="36"/>
+        </w:rPr>
+        <w:t>**********************</w:t>
+      </w:r>
     </w:p>
     <w:sectPr>
       <w:pgSz w:w="12240" w:h="15840"/>
-      <w:pgMar w:top="900" w:right="450" w:bottom="450" w:left="630" w:header="720" w:footer="720" w:gutter="0"/>
+      <w:pgMar w:top="900" w:right="450" w:bottom="990" w:left="900" w:header="720" w:footer="720" w:gutter="0"/>
       <w:pgBorders w:offsetFrom="page">
         <w:top w:val="christmasTree" w:sz="15" w:space="24" w:color="auto"/>
         <w:left w:val="christmasTree" w:sz="15" w:space="24" w:color="auto"/>
@@ -475,6 +3970,431 @@
     </w:sectPr>
   </w:body>
 </w:document>
+</file>
+
+<file path=word/numbering.xml><?xml version="1.0" encoding="utf-8"?>
+<w:numbering xmlns:wpc="http://schemas.microsoft.com/office/word/2010/wordprocessingCanvas" xmlns:mc="http://schemas.openxmlformats.org/markup-compatibility/2006" xmlns:o="urn:schemas-microsoft-com:office:office" xmlns:r="http://schemas.openxmlformats.org/officeDocument/2006/relationships" xmlns:m="http://schemas.openxmlformats.org/officeDocument/2006/math" xmlns:v="urn:schemas-microsoft-com:vml" xmlns:wp14="http://schemas.microsoft.com/office/word/2010/wordprocessingDrawing" xmlns:wp="http://schemas.openxmlformats.org/drawingml/2006/wordprocessingDrawing" xmlns:w10="urn:schemas-microsoft-com:office:word" xmlns:w="http://schemas.openxmlformats.org/wordprocessingml/2006/main" xmlns:w14="http://schemas.microsoft.com/office/word/2010/wordml" xmlns:w15="http://schemas.microsoft.com/office/word/2012/wordml" xmlns:wpg="http://schemas.microsoft.com/office/word/2010/wordprocessingGroup" xmlns:wpi="http://schemas.microsoft.com/office/word/2010/wordprocessingInk" xmlns:wne="http://schemas.microsoft.com/office/word/2006/wordml" xmlns:wps="http://schemas.microsoft.com/office/word/2010/wordprocessingShape" mc:Ignorable="w14 w15 wp14">
+  <w:abstractNum w:abstractNumId="0" w15:restartNumberingAfterBreak="0">
+    <w:nsid w:val="3F8E7708"/>
+    <w:multiLevelType w:val="multilevel"/>
+    <w:tmpl w:val="87181E2E"/>
+    <w:lvl w:ilvl="0">
+      <w:start w:val="1"/>
+      <w:numFmt w:val="bullet"/>
+      <w:lvlText w:val=""/>
+      <w:lvlJc w:val="left"/>
+      <w:pPr>
+        <w:tabs>
+          <w:tab w:val="num" w:pos="720"/>
+        </w:tabs>
+        <w:ind w:left="720" w:hanging="360"/>
+      </w:pPr>
+      <w:rPr>
+        <w:rFonts w:ascii="Symbol" w:hAnsi="Symbol" w:hint="default"/>
+        <w:sz w:val="20"/>
+      </w:rPr>
+    </w:lvl>
+    <w:lvl w:ilvl="1" w:tentative="1">
+      <w:start w:val="1"/>
+      <w:numFmt w:val="bullet"/>
+      <w:lvlText w:val="o"/>
+      <w:lvlJc w:val="left"/>
+      <w:pPr>
+        <w:tabs>
+          <w:tab w:val="num" w:pos="1440"/>
+        </w:tabs>
+        <w:ind w:left="1440" w:hanging="360"/>
+      </w:pPr>
+      <w:rPr>
+        <w:rFonts w:ascii="Courier New" w:hAnsi="Courier New" w:hint="default"/>
+        <w:sz w:val="20"/>
+      </w:rPr>
+    </w:lvl>
+    <w:lvl w:ilvl="2" w:tentative="1">
+      <w:start w:val="1"/>
+      <w:numFmt w:val="bullet"/>
+      <w:lvlText w:val=""/>
+      <w:lvlJc w:val="left"/>
+      <w:pPr>
+        <w:tabs>
+          <w:tab w:val="num" w:pos="2160"/>
+        </w:tabs>
+        <w:ind w:left="2160" w:hanging="360"/>
+      </w:pPr>
+      <w:rPr>
+        <w:rFonts w:ascii="Wingdings" w:hAnsi="Wingdings" w:hint="default"/>
+        <w:sz w:val="20"/>
+      </w:rPr>
+    </w:lvl>
+    <w:lvl w:ilvl="3" w:tentative="1">
+      <w:start w:val="1"/>
+      <w:numFmt w:val="bullet"/>
+      <w:lvlText w:val=""/>
+      <w:lvlJc w:val="left"/>
+      <w:pPr>
+        <w:tabs>
+          <w:tab w:val="num" w:pos="2880"/>
+        </w:tabs>
+        <w:ind w:left="2880" w:hanging="360"/>
+      </w:pPr>
+      <w:rPr>
+        <w:rFonts w:ascii="Wingdings" w:hAnsi="Wingdings" w:hint="default"/>
+        <w:sz w:val="20"/>
+      </w:rPr>
+    </w:lvl>
+    <w:lvl w:ilvl="4" w:tentative="1">
+      <w:start w:val="1"/>
+      <w:numFmt w:val="bullet"/>
+      <w:lvlText w:val=""/>
+      <w:lvlJc w:val="left"/>
+      <w:pPr>
+        <w:tabs>
+          <w:tab w:val="num" w:pos="3600"/>
+        </w:tabs>
+        <w:ind w:left="3600" w:hanging="360"/>
+      </w:pPr>
+      <w:rPr>
+        <w:rFonts w:ascii="Wingdings" w:hAnsi="Wingdings" w:hint="default"/>
+        <w:sz w:val="20"/>
+      </w:rPr>
+    </w:lvl>
+    <w:lvl w:ilvl="5" w:tentative="1">
+      <w:start w:val="1"/>
+      <w:numFmt w:val="bullet"/>
+      <w:lvlText w:val=""/>
+      <w:lvlJc w:val="left"/>
+      <w:pPr>
+        <w:tabs>
+          <w:tab w:val="num" w:pos="4320"/>
+        </w:tabs>
+        <w:ind w:left="4320" w:hanging="360"/>
+      </w:pPr>
+      <w:rPr>
+        <w:rFonts w:ascii="Wingdings" w:hAnsi="Wingdings" w:hint="default"/>
+        <w:sz w:val="20"/>
+      </w:rPr>
+    </w:lvl>
+    <w:lvl w:ilvl="6" w:tentative="1">
+      <w:start w:val="1"/>
+      <w:numFmt w:val="bullet"/>
+      <w:lvlText w:val=""/>
+      <w:lvlJc w:val="left"/>
+      <w:pPr>
+        <w:tabs>
+          <w:tab w:val="num" w:pos="5040"/>
+        </w:tabs>
+        <w:ind w:left="5040" w:hanging="360"/>
+      </w:pPr>
+      <w:rPr>
+        <w:rFonts w:ascii="Wingdings" w:hAnsi="Wingdings" w:hint="default"/>
+        <w:sz w:val="20"/>
+      </w:rPr>
+    </w:lvl>
+    <w:lvl w:ilvl="7" w:tentative="1">
+      <w:start w:val="1"/>
+      <w:numFmt w:val="bullet"/>
+      <w:lvlText w:val=""/>
+      <w:lvlJc w:val="left"/>
+      <w:pPr>
+        <w:tabs>
+          <w:tab w:val="num" w:pos="5760"/>
+        </w:tabs>
+        <w:ind w:left="5760" w:hanging="360"/>
+      </w:pPr>
+      <w:rPr>
+        <w:rFonts w:ascii="Wingdings" w:hAnsi="Wingdings" w:hint="default"/>
+        <w:sz w:val="20"/>
+      </w:rPr>
+    </w:lvl>
+    <w:lvl w:ilvl="8" w:tentative="1">
+      <w:start w:val="1"/>
+      <w:numFmt w:val="bullet"/>
+      <w:lvlText w:val=""/>
+      <w:lvlJc w:val="left"/>
+      <w:pPr>
+        <w:tabs>
+          <w:tab w:val="num" w:pos="6480"/>
+        </w:tabs>
+        <w:ind w:left="6480" w:hanging="360"/>
+      </w:pPr>
+      <w:rPr>
+        <w:rFonts w:ascii="Wingdings" w:hAnsi="Wingdings" w:hint="default"/>
+        <w:sz w:val="20"/>
+      </w:rPr>
+    </w:lvl>
+  </w:abstractNum>
+  <w:abstractNum w:abstractNumId="1" w15:restartNumberingAfterBreak="0">
+    <w:nsid w:val="65CC113F"/>
+    <w:multiLevelType w:val="multilevel"/>
+    <w:tmpl w:val="AD344084"/>
+    <w:lvl w:ilvl="0">
+      <w:start w:val="1"/>
+      <w:numFmt w:val="decimal"/>
+      <w:lvlText w:val="%1."/>
+      <w:lvlJc w:val="left"/>
+      <w:pPr>
+        <w:tabs>
+          <w:tab w:val="num" w:pos="720"/>
+        </w:tabs>
+        <w:ind w:left="720" w:hanging="360"/>
+      </w:pPr>
+    </w:lvl>
+    <w:lvl w:ilvl="1" w:tentative="1">
+      <w:start w:val="1"/>
+      <w:numFmt w:val="decimal"/>
+      <w:lvlText w:val="%2."/>
+      <w:lvlJc w:val="left"/>
+      <w:pPr>
+        <w:tabs>
+          <w:tab w:val="num" w:pos="1440"/>
+        </w:tabs>
+        <w:ind w:left="1440" w:hanging="360"/>
+      </w:pPr>
+    </w:lvl>
+    <w:lvl w:ilvl="2" w:tentative="1">
+      <w:start w:val="1"/>
+      <w:numFmt w:val="decimal"/>
+      <w:lvlText w:val="%3."/>
+      <w:lvlJc w:val="left"/>
+      <w:pPr>
+        <w:tabs>
+          <w:tab w:val="num" w:pos="2160"/>
+        </w:tabs>
+        <w:ind w:left="2160" w:hanging="360"/>
+      </w:pPr>
+    </w:lvl>
+    <w:lvl w:ilvl="3" w:tentative="1">
+      <w:start w:val="1"/>
+      <w:numFmt w:val="decimal"/>
+      <w:lvlText w:val="%4."/>
+      <w:lvlJc w:val="left"/>
+      <w:pPr>
+        <w:tabs>
+          <w:tab w:val="num" w:pos="2880"/>
+        </w:tabs>
+        <w:ind w:left="2880" w:hanging="360"/>
+      </w:pPr>
+    </w:lvl>
+    <w:lvl w:ilvl="4" w:tentative="1">
+      <w:start w:val="1"/>
+      <w:numFmt w:val="decimal"/>
+      <w:lvlText w:val="%5."/>
+      <w:lvlJc w:val="left"/>
+      <w:pPr>
+        <w:tabs>
+          <w:tab w:val="num" w:pos="3600"/>
+        </w:tabs>
+        <w:ind w:left="3600" w:hanging="360"/>
+      </w:pPr>
+    </w:lvl>
+    <w:lvl w:ilvl="5" w:tentative="1">
+      <w:start w:val="1"/>
+      <w:numFmt w:val="decimal"/>
+      <w:lvlText w:val="%6."/>
+      <w:lvlJc w:val="left"/>
+      <w:pPr>
+        <w:tabs>
+          <w:tab w:val="num" w:pos="4320"/>
+        </w:tabs>
+        <w:ind w:left="4320" w:hanging="360"/>
+      </w:pPr>
+    </w:lvl>
+    <w:lvl w:ilvl="6" w:tentative="1">
+      <w:start w:val="1"/>
+      <w:numFmt w:val="decimal"/>
+      <w:lvlText w:val="%7."/>
+      <w:lvlJc w:val="left"/>
+      <w:pPr>
+        <w:tabs>
+          <w:tab w:val="num" w:pos="5040"/>
+        </w:tabs>
+        <w:ind w:left="5040" w:hanging="360"/>
+      </w:pPr>
+    </w:lvl>
+    <w:lvl w:ilvl="7" w:tentative="1">
+      <w:start w:val="1"/>
+      <w:numFmt w:val="decimal"/>
+      <w:lvlText w:val="%8."/>
+      <w:lvlJc w:val="left"/>
+      <w:pPr>
+        <w:tabs>
+          <w:tab w:val="num" w:pos="5760"/>
+        </w:tabs>
+        <w:ind w:left="5760" w:hanging="360"/>
+      </w:pPr>
+    </w:lvl>
+    <w:lvl w:ilvl="8" w:tentative="1">
+      <w:start w:val="1"/>
+      <w:numFmt w:val="decimal"/>
+      <w:lvlText w:val="%9."/>
+      <w:lvlJc w:val="left"/>
+      <w:pPr>
+        <w:tabs>
+          <w:tab w:val="num" w:pos="6480"/>
+        </w:tabs>
+        <w:ind w:left="6480" w:hanging="360"/>
+      </w:pPr>
+    </w:lvl>
+  </w:abstractNum>
+  <w:abstractNum w:abstractNumId="2" w15:restartNumberingAfterBreak="0">
+    <w:nsid w:val="7C6E560D"/>
+    <w:multiLevelType w:val="multilevel"/>
+    <w:tmpl w:val="EBE661DE"/>
+    <w:lvl w:ilvl="0">
+      <w:start w:val="1"/>
+      <w:numFmt w:val="bullet"/>
+      <w:lvlText w:val=""/>
+      <w:lvlJc w:val="left"/>
+      <w:pPr>
+        <w:tabs>
+          <w:tab w:val="num" w:pos="720"/>
+        </w:tabs>
+        <w:ind w:left="720" w:hanging="360"/>
+      </w:pPr>
+      <w:rPr>
+        <w:rFonts w:ascii="Symbol" w:hAnsi="Symbol" w:hint="default"/>
+        <w:sz w:val="20"/>
+      </w:rPr>
+    </w:lvl>
+    <w:lvl w:ilvl="1" w:tentative="1">
+      <w:start w:val="1"/>
+      <w:numFmt w:val="bullet"/>
+      <w:lvlText w:val="o"/>
+      <w:lvlJc w:val="left"/>
+      <w:pPr>
+        <w:tabs>
+          <w:tab w:val="num" w:pos="1440"/>
+        </w:tabs>
+        <w:ind w:left="1440" w:hanging="360"/>
+      </w:pPr>
+      <w:rPr>
+        <w:rFonts w:ascii="Courier New" w:hAnsi="Courier New" w:hint="default"/>
+        <w:sz w:val="20"/>
+      </w:rPr>
+    </w:lvl>
+    <w:lvl w:ilvl="2" w:tentative="1">
+      <w:start w:val="1"/>
+      <w:numFmt w:val="bullet"/>
+      <w:lvlText w:val=""/>
+      <w:lvlJc w:val="left"/>
+      <w:pPr>
+        <w:tabs>
+          <w:tab w:val="num" w:pos="2160"/>
+        </w:tabs>
+        <w:ind w:left="2160" w:hanging="360"/>
+      </w:pPr>
+      <w:rPr>
+        <w:rFonts w:ascii="Wingdings" w:hAnsi="Wingdings" w:hint="default"/>
+        <w:sz w:val="20"/>
+      </w:rPr>
+    </w:lvl>
+    <w:lvl w:ilvl="3" w:tentative="1">
+      <w:start w:val="1"/>
+      <w:numFmt w:val="bullet"/>
+      <w:lvlText w:val=""/>
+      <w:lvlJc w:val="left"/>
+      <w:pPr>
+        <w:tabs>
+          <w:tab w:val="num" w:pos="2880"/>
+        </w:tabs>
+        <w:ind w:left="2880" w:hanging="360"/>
+      </w:pPr>
+      <w:rPr>
+        <w:rFonts w:ascii="Wingdings" w:hAnsi="Wingdings" w:hint="default"/>
+        <w:sz w:val="20"/>
+      </w:rPr>
+    </w:lvl>
+    <w:lvl w:ilvl="4" w:tentative="1">
+      <w:start w:val="1"/>
+      <w:numFmt w:val="bullet"/>
+      <w:lvlText w:val=""/>
+      <w:lvlJc w:val="left"/>
+      <w:pPr>
+        <w:tabs>
+          <w:tab w:val="num" w:pos="3600"/>
+        </w:tabs>
+        <w:ind w:left="3600" w:hanging="360"/>
+      </w:pPr>
+      <w:rPr>
+        <w:rFonts w:ascii="Wingdings" w:hAnsi="Wingdings" w:hint="default"/>
+        <w:sz w:val="20"/>
+      </w:rPr>
+    </w:lvl>
+    <w:lvl w:ilvl="5" w:tentative="1">
+      <w:start w:val="1"/>
+      <w:numFmt w:val="bullet"/>
+      <w:lvlText w:val=""/>
+      <w:lvlJc w:val="left"/>
+      <w:pPr>
+        <w:tabs>
+          <w:tab w:val="num" w:pos="4320"/>
+        </w:tabs>
+        <w:ind w:left="4320" w:hanging="360"/>
+      </w:pPr>
+      <w:rPr>
+        <w:rFonts w:ascii="Wingdings" w:hAnsi="Wingdings" w:hint="default"/>
+        <w:sz w:val="20"/>
+      </w:rPr>
+    </w:lvl>
+    <w:lvl w:ilvl="6" w:tentative="1">
+      <w:start w:val="1"/>
+      <w:numFmt w:val="bullet"/>
+      <w:lvlText w:val=""/>
+      <w:lvlJc w:val="left"/>
+      <w:pPr>
+        <w:tabs>
+          <w:tab w:val="num" w:pos="5040"/>
+        </w:tabs>
+        <w:ind w:left="5040" w:hanging="360"/>
+      </w:pPr>
+      <w:rPr>
+        <w:rFonts w:ascii="Wingdings" w:hAnsi="Wingdings" w:hint="default"/>
+        <w:sz w:val="20"/>
+      </w:rPr>
+    </w:lvl>
+    <w:lvl w:ilvl="7" w:tentative="1">
+      <w:start w:val="1"/>
+      <w:numFmt w:val="bullet"/>
+      <w:lvlText w:val=""/>
+      <w:lvlJc w:val="left"/>
+      <w:pPr>
+        <w:tabs>
+          <w:tab w:val="num" w:pos="5760"/>
+        </w:tabs>
+        <w:ind w:left="5760" w:hanging="360"/>
+      </w:pPr>
+      <w:rPr>
+        <w:rFonts w:ascii="Wingdings" w:hAnsi="Wingdings" w:hint="default"/>
+        <w:sz w:val="20"/>
+      </w:rPr>
+    </w:lvl>
+    <w:lvl w:ilvl="8" w:tentative="1">
+      <w:start w:val="1"/>
+      <w:numFmt w:val="bullet"/>
+      <w:lvlText w:val=""/>
+      <w:lvlJc w:val="left"/>
+      <w:pPr>
+        <w:tabs>
+          <w:tab w:val="num" w:pos="6480"/>
+        </w:tabs>
+        <w:ind w:left="6480" w:hanging="360"/>
+      </w:pPr>
+      <w:rPr>
+        <w:rFonts w:ascii="Wingdings" w:hAnsi="Wingdings" w:hint="default"/>
+        <w:sz w:val="20"/>
+      </w:rPr>
+    </w:lvl>
+  </w:abstractNum>
+  <w:num w:numId="1">
+    <w:abstractNumId w:val="2"/>
+  </w:num>
+  <w:num w:numId="2">
+    <w:abstractNumId w:val="1"/>
+  </w:num>
+  <w:num w:numId="3">
+    <w:abstractNumId w:val="0"/>
+  </w:num>
+</w:numbering>
 </file>
 
 <file path=word/styles.xml><?xml version="1.0" encoding="utf-8"?>
@@ -490,9 +4410,9 @@
   </w:docDefaults>
   <w:latentStyles w:defLockedState="0" w:defUIPriority="0" w:defSemiHidden="0" w:defUnhideWhenUsed="0" w:defQFormat="0" w:count="371">
     <w:lsdException w:name="Normal" w:qFormat="1"/>
-    <w:lsdException w:name="heading 1" w:qFormat="1"/>
+    <w:lsdException w:name="heading 1" w:uiPriority="9" w:qFormat="1"/>
     <w:lsdException w:name="heading 2" w:semiHidden="1" w:unhideWhenUsed="1" w:qFormat="1"/>
-    <w:lsdException w:name="heading 3" w:semiHidden="1" w:unhideWhenUsed="1" w:qFormat="1"/>
+    <w:lsdException w:name="heading 3" w:semiHidden="1" w:uiPriority="9" w:unhideWhenUsed="1" w:qFormat="1"/>
     <w:lsdException w:name="heading 4" w:semiHidden="1" w:unhideWhenUsed="1" w:qFormat="1"/>
     <w:lsdException w:name="heading 5" w:semiHidden="1" w:unhideWhenUsed="1" w:qFormat="1"/>
     <w:lsdException w:name="heading 6" w:semiHidden="1" w:unhideWhenUsed="1" w:qFormat="1"/>
@@ -502,8 +4422,11 @@
     <w:lsdException w:name="caption" w:semiHidden="1" w:unhideWhenUsed="1" w:qFormat="1"/>
     <w:lsdException w:name="Title" w:qFormat="1"/>
     <w:lsdException w:name="Subtitle" w:qFormat="1"/>
-    <w:lsdException w:name="Strong" w:qFormat="1"/>
-    <w:lsdException w:name="Emphasis" w:qFormat="1"/>
+    <w:lsdException w:name="Strong" w:uiPriority="22" w:qFormat="1"/>
+    <w:lsdException w:name="Emphasis" w:uiPriority="20" w:qFormat="1"/>
+    <w:lsdException w:name="Normal (Web)" w:uiPriority="99"/>
+    <w:lsdException w:name="HTML Code" w:uiPriority="99"/>
+    <w:lsdException w:name="HTML Preformatted" w:uiPriority="99"/>
     <w:lsdException w:name="Normal Table" w:semiHidden="1" w:unhideWhenUsed="1"/>
     <w:lsdException w:name="Table Simple 1" w:semiHidden="1" w:unhideWhenUsed="1"/>
     <w:lsdException w:name="Table Simple 2" w:semiHidden="1" w:unhideWhenUsed="1"/>
@@ -777,6 +4700,45 @@
       <w:szCs w:val="22"/>
     </w:rPr>
   </w:style>
+  <w:style w:type="paragraph" w:styleId="Heading1">
+    <w:name w:val="heading 1"/>
+    <w:basedOn w:val="Normal"/>
+    <w:link w:val="Heading1Char"/>
+    <w:uiPriority w:val="9"/>
+    <w:qFormat/>
+    <w:rsid w:val="003C5E18"/>
+    <w:pPr>
+      <w:spacing w:before="100" w:beforeAutospacing="1" w:after="100" w:afterAutospacing="1" w:line="240" w:lineRule="auto"/>
+      <w:outlineLvl w:val="0"/>
+    </w:pPr>
+    <w:rPr>
+      <w:rFonts w:ascii="Times New Roman" w:eastAsia="Times New Roman" w:hAnsi="Times New Roman" w:cs="Times New Roman"/>
+      <w:b/>
+      <w:bCs/>
+      <w:kern w:val="36"/>
+      <w:sz w:val="48"/>
+      <w:szCs w:val="48"/>
+    </w:rPr>
+  </w:style>
+  <w:style w:type="paragraph" w:styleId="Heading3">
+    <w:name w:val="heading 3"/>
+    <w:basedOn w:val="Normal"/>
+    <w:link w:val="Heading3Char"/>
+    <w:uiPriority w:val="9"/>
+    <w:qFormat/>
+    <w:rsid w:val="003C5E18"/>
+    <w:pPr>
+      <w:spacing w:before="100" w:beforeAutospacing="1" w:after="100" w:afterAutospacing="1" w:line="240" w:lineRule="auto"/>
+      <w:outlineLvl w:val="2"/>
+    </w:pPr>
+    <w:rPr>
+      <w:rFonts w:ascii="Times New Roman" w:eastAsia="Times New Roman" w:hAnsi="Times New Roman" w:cs="Times New Roman"/>
+      <w:b/>
+      <w:bCs/>
+      <w:sz w:val="27"/>
+      <w:szCs w:val="27"/>
+    </w:rPr>
+  </w:style>
   <w:style w:type="character" w:default="1" w:styleId="DefaultParagraphFont">
     <w:name w:val="Default Paragraph Font"/>
     <w:uiPriority w:val="1"/>
@@ -803,6 +4765,141 @@
     <w:uiPriority w:val="99"/>
     <w:semiHidden/>
     <w:unhideWhenUsed/>
+  </w:style>
+  <w:style w:type="character" w:customStyle="1" w:styleId="Heading1Char">
+    <w:name w:val="Heading 1 Char"/>
+    <w:basedOn w:val="DefaultParagraphFont"/>
+    <w:link w:val="Heading1"/>
+    <w:uiPriority w:val="9"/>
+    <w:rsid w:val="003C5E18"/>
+    <w:rPr>
+      <w:b/>
+      <w:bCs/>
+      <w:kern w:val="36"/>
+      <w:sz w:val="48"/>
+      <w:szCs w:val="48"/>
+    </w:rPr>
+  </w:style>
+  <w:style w:type="character" w:customStyle="1" w:styleId="Heading3Char">
+    <w:name w:val="Heading 3 Char"/>
+    <w:basedOn w:val="DefaultParagraphFont"/>
+    <w:link w:val="Heading3"/>
+    <w:uiPriority w:val="9"/>
+    <w:rsid w:val="003C5E18"/>
+    <w:rPr>
+      <w:b/>
+      <w:bCs/>
+      <w:sz w:val="27"/>
+      <w:szCs w:val="27"/>
+    </w:rPr>
+  </w:style>
+  <w:style w:type="character" w:styleId="Strong">
+    <w:name w:val="Strong"/>
+    <w:basedOn w:val="DefaultParagraphFont"/>
+    <w:uiPriority w:val="22"/>
+    <w:qFormat/>
+    <w:rsid w:val="003C5E18"/>
+    <w:rPr>
+      <w:b/>
+      <w:bCs/>
+    </w:rPr>
+  </w:style>
+  <w:style w:type="paragraph" w:styleId="HTMLPreformatted">
+    <w:name w:val="HTML Preformatted"/>
+    <w:basedOn w:val="Normal"/>
+    <w:link w:val="HTMLPreformattedChar"/>
+    <w:uiPriority w:val="99"/>
+    <w:unhideWhenUsed/>
+    <w:rsid w:val="003C5E18"/>
+    <w:pPr>
+      <w:tabs>
+        <w:tab w:val="left" w:pos="916"/>
+        <w:tab w:val="left" w:pos="1832"/>
+        <w:tab w:val="left" w:pos="2748"/>
+        <w:tab w:val="left" w:pos="3664"/>
+        <w:tab w:val="left" w:pos="4580"/>
+        <w:tab w:val="left" w:pos="5496"/>
+        <w:tab w:val="left" w:pos="6412"/>
+        <w:tab w:val="left" w:pos="7328"/>
+        <w:tab w:val="left" w:pos="8244"/>
+        <w:tab w:val="left" w:pos="9160"/>
+        <w:tab w:val="left" w:pos="10076"/>
+        <w:tab w:val="left" w:pos="10992"/>
+        <w:tab w:val="left" w:pos="11908"/>
+        <w:tab w:val="left" w:pos="12824"/>
+        <w:tab w:val="left" w:pos="13740"/>
+        <w:tab w:val="left" w:pos="14656"/>
+      </w:tabs>
+      <w:spacing w:after="0" w:line="240" w:lineRule="auto"/>
+    </w:pPr>
+    <w:rPr>
+      <w:rFonts w:ascii="Courier New" w:eastAsia="Times New Roman" w:hAnsi="Courier New" w:cs="Courier New"/>
+      <w:sz w:val="20"/>
+      <w:szCs w:val="20"/>
+    </w:rPr>
+  </w:style>
+  <w:style w:type="character" w:customStyle="1" w:styleId="HTMLPreformattedChar">
+    <w:name w:val="HTML Preformatted Char"/>
+    <w:basedOn w:val="DefaultParagraphFont"/>
+    <w:link w:val="HTMLPreformatted"/>
+    <w:uiPriority w:val="99"/>
+    <w:rsid w:val="003C5E18"/>
+    <w:rPr>
+      <w:rFonts w:ascii="Courier New" w:hAnsi="Courier New" w:cs="Courier New"/>
+    </w:rPr>
+  </w:style>
+  <w:style w:type="character" w:customStyle="1" w:styleId="n">
+    <w:name w:val="ͼn"/>
+    <w:basedOn w:val="DefaultParagraphFont"/>
+    <w:rsid w:val="003C5E18"/>
+  </w:style>
+  <w:style w:type="character" w:customStyle="1" w:styleId="t">
+    <w:name w:val="ͼt"/>
+    <w:basedOn w:val="DefaultParagraphFont"/>
+    <w:rsid w:val="003C5E18"/>
+  </w:style>
+  <w:style w:type="character" w:customStyle="1" w:styleId="q">
+    <w:name w:val="ͼq"/>
+    <w:basedOn w:val="DefaultParagraphFont"/>
+    <w:rsid w:val="003C5E18"/>
+  </w:style>
+  <w:style w:type="paragraph" w:styleId="NormalWeb">
+    <w:name w:val="Normal (Web)"/>
+    <w:basedOn w:val="Normal"/>
+    <w:uiPriority w:val="99"/>
+    <w:unhideWhenUsed/>
+    <w:rsid w:val="003C5E18"/>
+    <w:pPr>
+      <w:spacing w:before="100" w:beforeAutospacing="1" w:after="100" w:afterAutospacing="1" w:line="240" w:lineRule="auto"/>
+    </w:pPr>
+    <w:rPr>
+      <w:rFonts w:ascii="Times New Roman" w:eastAsia="Times New Roman" w:hAnsi="Times New Roman" w:cs="Times New Roman"/>
+      <w:sz w:val="24"/>
+      <w:szCs w:val="24"/>
+    </w:rPr>
+  </w:style>
+  <w:style w:type="character" w:styleId="Emphasis">
+    <w:name w:val="Emphasis"/>
+    <w:basedOn w:val="DefaultParagraphFont"/>
+    <w:uiPriority w:val="20"/>
+    <w:qFormat/>
+    <w:rsid w:val="003C5E18"/>
+    <w:rPr>
+      <w:i/>
+      <w:iCs/>
+    </w:rPr>
+  </w:style>
+  <w:style w:type="character" w:styleId="HTMLCode">
+    <w:name w:val="HTML Code"/>
+    <w:basedOn w:val="DefaultParagraphFont"/>
+    <w:uiPriority w:val="99"/>
+    <w:unhideWhenUsed/>
+    <w:rsid w:val="003C5E18"/>
+    <w:rPr>
+      <w:rFonts w:ascii="Courier New" w:eastAsia="Times New Roman" w:hAnsi="Courier New" w:cs="Courier New"/>
+      <w:sz w:val="20"/>
+      <w:szCs w:val="20"/>
+    </w:rPr>
   </w:style>
 </w:styles>
 </file>

</xml_diff>